<commit_message>
feat(redaction-memoire): apports d'un troisième mémoire validé, déploiement et coûts, comparatifs (v1.6.0)
</commit_message>
<xml_diff>
--- a/plugins/dev-memoire-kit/skills/redaction-memoire/assets/modele-memoire.docx
+++ b/plugins/dev-memoire-kit/skills/redaction-memoire/assets/modele-memoire.docx
@@ -4789,7 +4789,7 @@
         <w:pStyle w:val="Consigne"/>
       </w:pPr>
       <w:r>
-        <w:t xml:space="preserve">[Introduction du chapitre : annoncer ses quatre sections dans l'ordre.]</w:t>
+        <w:t xml:space="preserve">[Introduction du chapitre : annoncer ses sections dans l'ordre et en nombre exact (quatre, ou cinq avec le déploiement).]</w:t>
       </w:r>
     </w:p>
     <w:p>
@@ -4805,7 +4805,7 @@
         <w:pStyle w:val="Consigne"/>
       </w:pPr>
       <w:r>
-        <w:t xml:space="preserve">[Critères de choix, et pour les choix structurants l'alternative écartée. Un tableau plutôt qu'un logo numéroté par outil.]</w:t>
+        <w:t xml:space="preserve">[Critères de choix. Pour chaque choix structurant (back-end, web, mobile, base de données), une étude comparative avec les mêmes colonnes, puis « Choix et justification » relié à une exigence.]</w:t>
       </w:r>
     </w:p>
     <w:p>
@@ -4813,7 +4813,739 @@
         <w:pStyle w:val="LegendeTableau"/>
       </w:pPr>
       <w:r>
-        <w:t xml:space="preserve">Tableau 3.1 : Outils et technologies utilisés</w:t>
+        <w:t xml:space="preserve">Tableau 3.1 : Étude comparative des frameworks [back-end]</w:t>
+      </w:r>
+    </w:p>
+    <w:tbl>
+      <w:tblPr>
+        <w:tblW w:type="dxa" w:w="7936"/>
+        <w:tblBorders>
+          <w:top w:val="single" w:color="auto" w:sz="4"/>
+          <w:left w:val="single" w:color="auto" w:sz="4"/>
+          <w:bottom w:val="single" w:color="auto" w:sz="4"/>
+          <w:right w:val="single" w:color="auto" w:sz="4"/>
+          <w:insideH w:val="single" w:color="auto" w:sz="4"/>
+          <w:insideV w:val="single" w:color="auto" w:sz="4"/>
+        </w:tblBorders>
+      </w:tblPr>
+      <w:tblGrid>
+        <w:gridCol w:w="1517"/>
+        <w:gridCol w:w="1167"/>
+        <w:gridCol w:w="1750"/>
+        <w:gridCol w:w="1750"/>
+        <w:gridCol w:w="1752"/>
+      </w:tblGrid>
+      <w:tr>
+        <w:trPr>
+          <w:tblHeader/>
+        </w:trPr>
+        <w:tc>
+          <w:tcPr>
+            <w:tcW w:type="dxa" w:w="1517"/>
+            <w:tcBorders>
+              <w:top w:val="single" w:color="808080" w:sz="4"/>
+              <w:left w:val="single" w:color="808080" w:sz="4"/>
+              <w:bottom w:val="single" w:color="808080" w:sz="4"/>
+              <w:right w:val="single" w:color="808080" w:sz="4"/>
+            </w:tcBorders>
+            <w:shd w:fill="D9E2F3" w:color="auto" w:val="clear"/>
+            <w:tcMar>
+              <w:top w:type="dxa" w:w="60"/>
+              <w:left w:type="dxa" w:w="100"/>
+              <w:bottom w:type="dxa" w:w="60"/>
+              <w:right w:type="dxa" w:w="100"/>
+            </w:tcMar>
+            <w:vAlign w:val="center"/>
+          </w:tcPr>
+          <w:p>
+            <w:pPr>
+              <w:spacing w:after="40" w:line="240"/>
+              <w:ind w:firstLine="0"/>
+              <w:jc w:val="left"/>
+            </w:pPr>
+            <w:r>
+              <w:rPr>
+                <w:b/>
+                <w:bCs/>
+                <w:sz w:val="22"/>
+                <w:szCs w:val="22"/>
+              </w:rPr>
+              <w:t xml:space="preserve">Framework (version)</w:t>
+            </w:r>
+          </w:p>
+        </w:tc>
+        <w:tc>
+          <w:tcPr>
+            <w:tcW w:type="dxa" w:w="1167"/>
+            <w:tcBorders>
+              <w:top w:val="single" w:color="808080" w:sz="4"/>
+              <w:left w:val="single" w:color="808080" w:sz="4"/>
+              <w:bottom w:val="single" w:color="808080" w:sz="4"/>
+              <w:right w:val="single" w:color="808080" w:sz="4"/>
+            </w:tcBorders>
+            <w:shd w:fill="D9E2F3" w:color="auto" w:val="clear"/>
+            <w:tcMar>
+              <w:top w:type="dxa" w:w="60"/>
+              <w:left w:type="dxa" w:w="100"/>
+              <w:bottom w:type="dxa" w:w="60"/>
+              <w:right w:type="dxa" w:w="100"/>
+            </w:tcMar>
+            <w:vAlign w:val="center"/>
+          </w:tcPr>
+          <w:p>
+            <w:pPr>
+              <w:spacing w:after="40" w:line="240"/>
+              <w:ind w:firstLine="0"/>
+              <w:jc w:val="left"/>
+            </w:pPr>
+            <w:r>
+              <w:rPr>
+                <w:b/>
+                <w:bCs/>
+                <w:sz w:val="22"/>
+                <w:szCs w:val="22"/>
+              </w:rPr>
+              <w:t xml:space="preserve">Langage</w:t>
+            </w:r>
+          </w:p>
+        </w:tc>
+        <w:tc>
+          <w:tcPr>
+            <w:tcW w:type="dxa" w:w="1750"/>
+            <w:tcBorders>
+              <w:top w:val="single" w:color="808080" w:sz="4"/>
+              <w:left w:val="single" w:color="808080" w:sz="4"/>
+              <w:bottom w:val="single" w:color="808080" w:sz="4"/>
+              <w:right w:val="single" w:color="808080" w:sz="4"/>
+            </w:tcBorders>
+            <w:shd w:fill="D9E2F3" w:color="auto" w:val="clear"/>
+            <w:tcMar>
+              <w:top w:type="dxa" w:w="60"/>
+              <w:left w:type="dxa" w:w="100"/>
+              <w:bottom w:type="dxa" w:w="60"/>
+              <w:right w:type="dxa" w:w="100"/>
+            </w:tcMar>
+            <w:vAlign w:val="center"/>
+          </w:tcPr>
+          <w:p>
+            <w:pPr>
+              <w:spacing w:after="40" w:line="240"/>
+              <w:ind w:firstLine="0"/>
+              <w:jc w:val="left"/>
+            </w:pPr>
+            <w:r>
+              <w:rPr>
+                <w:b/>
+                <w:bCs/>
+                <w:sz w:val="22"/>
+                <w:szCs w:val="22"/>
+              </w:rPr>
+              <w:t xml:space="preserve">Points forts</w:t>
+            </w:r>
+          </w:p>
+        </w:tc>
+        <w:tc>
+          <w:tcPr>
+            <w:tcW w:type="dxa" w:w="1750"/>
+            <w:tcBorders>
+              <w:top w:val="single" w:color="808080" w:sz="4"/>
+              <w:left w:val="single" w:color="808080" w:sz="4"/>
+              <w:bottom w:val="single" w:color="808080" w:sz="4"/>
+              <w:right w:val="single" w:color="808080" w:sz="4"/>
+            </w:tcBorders>
+            <w:shd w:fill="D9E2F3" w:color="auto" w:val="clear"/>
+            <w:tcMar>
+              <w:top w:type="dxa" w:w="60"/>
+              <w:left w:type="dxa" w:w="100"/>
+              <w:bottom w:type="dxa" w:w="60"/>
+              <w:right w:type="dxa" w:w="100"/>
+            </w:tcMar>
+            <w:vAlign w:val="center"/>
+          </w:tcPr>
+          <w:p>
+            <w:pPr>
+              <w:spacing w:after="40" w:line="240"/>
+              <w:ind w:firstLine="0"/>
+              <w:jc w:val="left"/>
+            </w:pPr>
+            <w:r>
+              <w:rPr>
+                <w:b/>
+                <w:bCs/>
+                <w:sz w:val="22"/>
+                <w:szCs w:val="22"/>
+              </w:rPr>
+              <w:t xml:space="preserve">Points faibles</w:t>
+            </w:r>
+          </w:p>
+        </w:tc>
+        <w:tc>
+          <w:tcPr>
+            <w:tcW w:type="dxa" w:w="1752"/>
+            <w:tcBorders>
+              <w:top w:val="single" w:color="808080" w:sz="4"/>
+              <w:left w:val="single" w:color="808080" w:sz="4"/>
+              <w:bottom w:val="single" w:color="808080" w:sz="4"/>
+              <w:right w:val="single" w:color="808080" w:sz="4"/>
+            </w:tcBorders>
+            <w:shd w:fill="D9E2F3" w:color="auto" w:val="clear"/>
+            <w:tcMar>
+              <w:top w:type="dxa" w:w="60"/>
+              <w:left w:type="dxa" w:w="100"/>
+              <w:bottom w:type="dxa" w:w="60"/>
+              <w:right w:type="dxa" w:w="100"/>
+            </w:tcMar>
+            <w:vAlign w:val="center"/>
+          </w:tcPr>
+          <w:p>
+            <w:pPr>
+              <w:spacing w:after="40" w:line="240"/>
+              <w:ind w:firstLine="0"/>
+              <w:jc w:val="left"/>
+            </w:pPr>
+            <w:r>
+              <w:rPr>
+                <w:b/>
+                <w:bCs/>
+                <w:sz w:val="22"/>
+                <w:szCs w:val="22"/>
+              </w:rPr>
+              <w:t xml:space="preserve">Adéquation au projet</w:t>
+            </w:r>
+          </w:p>
+        </w:tc>
+      </w:tr>
+      <w:tr>
+        <w:tc>
+          <w:tcPr>
+            <w:tcW w:type="dxa" w:w="1517"/>
+            <w:tcBorders>
+              <w:top w:val="single" w:color="808080" w:sz="4"/>
+              <w:left w:val="single" w:color="808080" w:sz="4"/>
+              <w:bottom w:val="single" w:color="808080" w:sz="4"/>
+              <w:right w:val="single" w:color="808080" w:sz="4"/>
+            </w:tcBorders>
+            <w:tcMar>
+              <w:top w:type="dxa" w:w="60"/>
+              <w:left w:type="dxa" w:w="100"/>
+              <w:bottom w:type="dxa" w:w="60"/>
+              <w:right w:type="dxa" w:w="100"/>
+            </w:tcMar>
+            <w:vAlign w:val="center"/>
+          </w:tcPr>
+          <w:p>
+            <w:pPr>
+              <w:spacing w:after="40" w:line="240"/>
+              <w:ind w:firstLine="0"/>
+              <w:jc w:val="left"/>
+            </w:pPr>
+            <w:r>
+              <w:rPr>
+                <w:b/>
+                <w:bCs/>
+                <w:sz w:val="22"/>
+                <w:szCs w:val="22"/>
+              </w:rPr>
+              <w:t xml:space="preserve">[Candidat 1]</w:t>
+            </w:r>
+          </w:p>
+        </w:tc>
+        <w:tc>
+          <w:tcPr>
+            <w:tcW w:type="dxa" w:w="1167"/>
+            <w:tcBorders>
+              <w:top w:val="single" w:color="808080" w:sz="4"/>
+              <w:left w:val="single" w:color="808080" w:sz="4"/>
+              <w:bottom w:val="single" w:color="808080" w:sz="4"/>
+              <w:right w:val="single" w:color="808080" w:sz="4"/>
+            </w:tcBorders>
+            <w:tcMar>
+              <w:top w:type="dxa" w:w="60"/>
+              <w:left w:type="dxa" w:w="100"/>
+              <w:bottom w:type="dxa" w:w="60"/>
+              <w:right w:type="dxa" w:w="100"/>
+            </w:tcMar>
+            <w:vAlign w:val="center"/>
+          </w:tcPr>
+          <w:p>
+            <w:pPr>
+              <w:spacing w:after="40" w:line="240"/>
+              <w:ind w:firstLine="0"/>
+              <w:jc w:val="left"/>
+            </w:pPr>
+            <w:r>
+              <w:rPr>
+                <w:b w:val="false"/>
+                <w:bCs w:val="false"/>
+                <w:sz w:val="22"/>
+                <w:szCs w:val="22"/>
+              </w:rPr>
+              <w:t xml:space="preserve">[…]</w:t>
+            </w:r>
+          </w:p>
+        </w:tc>
+        <w:tc>
+          <w:tcPr>
+            <w:tcW w:type="dxa" w:w="1750"/>
+            <w:tcBorders>
+              <w:top w:val="single" w:color="808080" w:sz="4"/>
+              <w:left w:val="single" w:color="808080" w:sz="4"/>
+              <w:bottom w:val="single" w:color="808080" w:sz="4"/>
+              <w:right w:val="single" w:color="808080" w:sz="4"/>
+            </w:tcBorders>
+            <w:tcMar>
+              <w:top w:type="dxa" w:w="60"/>
+              <w:left w:type="dxa" w:w="100"/>
+              <w:bottom w:type="dxa" w:w="60"/>
+              <w:right w:type="dxa" w:w="100"/>
+            </w:tcMar>
+            <w:vAlign w:val="center"/>
+          </w:tcPr>
+          <w:p>
+            <w:pPr>
+              <w:spacing w:after="40" w:line="240"/>
+              <w:ind w:firstLine="0"/>
+              <w:jc w:val="left"/>
+            </w:pPr>
+            <w:r>
+              <w:rPr>
+                <w:b w:val="false"/>
+                <w:bCs w:val="false"/>
+                <w:sz w:val="22"/>
+                <w:szCs w:val="22"/>
+              </w:rPr>
+              <w:t xml:space="preserve">[…]</w:t>
+            </w:r>
+          </w:p>
+        </w:tc>
+        <w:tc>
+          <w:tcPr>
+            <w:tcW w:type="dxa" w:w="1750"/>
+            <w:tcBorders>
+              <w:top w:val="single" w:color="808080" w:sz="4"/>
+              <w:left w:val="single" w:color="808080" w:sz="4"/>
+              <w:bottom w:val="single" w:color="808080" w:sz="4"/>
+              <w:right w:val="single" w:color="808080" w:sz="4"/>
+            </w:tcBorders>
+            <w:tcMar>
+              <w:top w:type="dxa" w:w="60"/>
+              <w:left w:type="dxa" w:w="100"/>
+              <w:bottom w:type="dxa" w:w="60"/>
+              <w:right w:type="dxa" w:w="100"/>
+            </w:tcMar>
+            <w:vAlign w:val="center"/>
+          </w:tcPr>
+          <w:p>
+            <w:pPr>
+              <w:spacing w:after="40" w:line="240"/>
+              <w:ind w:firstLine="0"/>
+              <w:jc w:val="left"/>
+            </w:pPr>
+            <w:r>
+              <w:rPr>
+                <w:b w:val="false"/>
+                <w:bCs w:val="false"/>
+                <w:sz w:val="22"/>
+                <w:szCs w:val="22"/>
+              </w:rPr>
+              <w:t xml:space="preserve">[…]</w:t>
+            </w:r>
+          </w:p>
+        </w:tc>
+        <w:tc>
+          <w:tcPr>
+            <w:tcW w:type="dxa" w:w="1752"/>
+            <w:tcBorders>
+              <w:top w:val="single" w:color="808080" w:sz="4"/>
+              <w:left w:val="single" w:color="808080" w:sz="4"/>
+              <w:bottom w:val="single" w:color="808080" w:sz="4"/>
+              <w:right w:val="single" w:color="808080" w:sz="4"/>
+            </w:tcBorders>
+            <w:tcMar>
+              <w:top w:type="dxa" w:w="60"/>
+              <w:left w:type="dxa" w:w="100"/>
+              <w:bottom w:type="dxa" w:w="60"/>
+              <w:right w:type="dxa" w:w="100"/>
+            </w:tcMar>
+            <w:vAlign w:val="center"/>
+          </w:tcPr>
+          <w:p>
+            <w:pPr>
+              <w:spacing w:after="40" w:line="240"/>
+              <w:ind w:firstLine="0"/>
+              <w:jc w:val="left"/>
+            </w:pPr>
+            <w:r>
+              <w:rPr>
+                <w:b w:val="false"/>
+                <w:bCs w:val="false"/>
+                <w:sz w:val="22"/>
+                <w:szCs w:val="22"/>
+              </w:rPr>
+              <w:t xml:space="preserve">[…]</w:t>
+            </w:r>
+          </w:p>
+        </w:tc>
+      </w:tr>
+      <w:tr>
+        <w:tc>
+          <w:tcPr>
+            <w:tcW w:type="dxa" w:w="1517"/>
+            <w:tcBorders>
+              <w:top w:val="single" w:color="808080" w:sz="4"/>
+              <w:left w:val="single" w:color="808080" w:sz="4"/>
+              <w:bottom w:val="single" w:color="808080" w:sz="4"/>
+              <w:right w:val="single" w:color="808080" w:sz="4"/>
+            </w:tcBorders>
+            <w:tcMar>
+              <w:top w:type="dxa" w:w="60"/>
+              <w:left w:type="dxa" w:w="100"/>
+              <w:bottom w:type="dxa" w:w="60"/>
+              <w:right w:type="dxa" w:w="100"/>
+            </w:tcMar>
+            <w:vAlign w:val="center"/>
+          </w:tcPr>
+          <w:p>
+            <w:pPr>
+              <w:spacing w:after="40" w:line="240"/>
+              <w:ind w:firstLine="0"/>
+              <w:jc w:val="left"/>
+            </w:pPr>
+            <w:r>
+              <w:rPr>
+                <w:b/>
+                <w:bCs/>
+                <w:sz w:val="22"/>
+                <w:szCs w:val="22"/>
+              </w:rPr>
+              <w:t xml:space="preserve">[Candidat 2]</w:t>
+            </w:r>
+          </w:p>
+        </w:tc>
+        <w:tc>
+          <w:tcPr>
+            <w:tcW w:type="dxa" w:w="1167"/>
+            <w:tcBorders>
+              <w:top w:val="single" w:color="808080" w:sz="4"/>
+              <w:left w:val="single" w:color="808080" w:sz="4"/>
+              <w:bottom w:val="single" w:color="808080" w:sz="4"/>
+              <w:right w:val="single" w:color="808080" w:sz="4"/>
+            </w:tcBorders>
+            <w:tcMar>
+              <w:top w:type="dxa" w:w="60"/>
+              <w:left w:type="dxa" w:w="100"/>
+              <w:bottom w:type="dxa" w:w="60"/>
+              <w:right w:type="dxa" w:w="100"/>
+            </w:tcMar>
+            <w:vAlign w:val="center"/>
+          </w:tcPr>
+          <w:p>
+            <w:pPr>
+              <w:spacing w:after="40" w:line="240"/>
+              <w:ind w:firstLine="0"/>
+              <w:jc w:val="left"/>
+            </w:pPr>
+            <w:r>
+              <w:rPr>
+                <w:b w:val="false"/>
+                <w:bCs w:val="false"/>
+                <w:sz w:val="22"/>
+                <w:szCs w:val="22"/>
+              </w:rPr>
+              <w:t xml:space="preserve">[…]</w:t>
+            </w:r>
+          </w:p>
+        </w:tc>
+        <w:tc>
+          <w:tcPr>
+            <w:tcW w:type="dxa" w:w="1750"/>
+            <w:tcBorders>
+              <w:top w:val="single" w:color="808080" w:sz="4"/>
+              <w:left w:val="single" w:color="808080" w:sz="4"/>
+              <w:bottom w:val="single" w:color="808080" w:sz="4"/>
+              <w:right w:val="single" w:color="808080" w:sz="4"/>
+            </w:tcBorders>
+            <w:tcMar>
+              <w:top w:type="dxa" w:w="60"/>
+              <w:left w:type="dxa" w:w="100"/>
+              <w:bottom w:type="dxa" w:w="60"/>
+              <w:right w:type="dxa" w:w="100"/>
+            </w:tcMar>
+            <w:vAlign w:val="center"/>
+          </w:tcPr>
+          <w:p>
+            <w:pPr>
+              <w:spacing w:after="40" w:line="240"/>
+              <w:ind w:firstLine="0"/>
+              <w:jc w:val="left"/>
+            </w:pPr>
+            <w:r>
+              <w:rPr>
+                <w:b w:val="false"/>
+                <w:bCs w:val="false"/>
+                <w:sz w:val="22"/>
+                <w:szCs w:val="22"/>
+              </w:rPr>
+              <w:t xml:space="preserve">[…]</w:t>
+            </w:r>
+          </w:p>
+        </w:tc>
+        <w:tc>
+          <w:tcPr>
+            <w:tcW w:type="dxa" w:w="1750"/>
+            <w:tcBorders>
+              <w:top w:val="single" w:color="808080" w:sz="4"/>
+              <w:left w:val="single" w:color="808080" w:sz="4"/>
+              <w:bottom w:val="single" w:color="808080" w:sz="4"/>
+              <w:right w:val="single" w:color="808080" w:sz="4"/>
+            </w:tcBorders>
+            <w:tcMar>
+              <w:top w:type="dxa" w:w="60"/>
+              <w:left w:type="dxa" w:w="100"/>
+              <w:bottom w:type="dxa" w:w="60"/>
+              <w:right w:type="dxa" w:w="100"/>
+            </w:tcMar>
+            <w:vAlign w:val="center"/>
+          </w:tcPr>
+          <w:p>
+            <w:pPr>
+              <w:spacing w:after="40" w:line="240"/>
+              <w:ind w:firstLine="0"/>
+              <w:jc w:val="left"/>
+            </w:pPr>
+            <w:r>
+              <w:rPr>
+                <w:b w:val="false"/>
+                <w:bCs w:val="false"/>
+                <w:sz w:val="22"/>
+                <w:szCs w:val="22"/>
+              </w:rPr>
+              <w:t xml:space="preserve">[…]</w:t>
+            </w:r>
+          </w:p>
+        </w:tc>
+        <w:tc>
+          <w:tcPr>
+            <w:tcW w:type="dxa" w:w="1752"/>
+            <w:tcBorders>
+              <w:top w:val="single" w:color="808080" w:sz="4"/>
+              <w:left w:val="single" w:color="808080" w:sz="4"/>
+              <w:bottom w:val="single" w:color="808080" w:sz="4"/>
+              <w:right w:val="single" w:color="808080" w:sz="4"/>
+            </w:tcBorders>
+            <w:tcMar>
+              <w:top w:type="dxa" w:w="60"/>
+              <w:left w:type="dxa" w:w="100"/>
+              <w:bottom w:type="dxa" w:w="60"/>
+              <w:right w:type="dxa" w:w="100"/>
+            </w:tcMar>
+            <w:vAlign w:val="center"/>
+          </w:tcPr>
+          <w:p>
+            <w:pPr>
+              <w:spacing w:after="40" w:line="240"/>
+              <w:ind w:firstLine="0"/>
+              <w:jc w:val="left"/>
+            </w:pPr>
+            <w:r>
+              <w:rPr>
+                <w:b w:val="false"/>
+                <w:bCs w:val="false"/>
+                <w:sz w:val="22"/>
+                <w:szCs w:val="22"/>
+              </w:rPr>
+              <w:t xml:space="preserve">[…]</w:t>
+            </w:r>
+          </w:p>
+        </w:tc>
+      </w:tr>
+      <w:tr>
+        <w:tc>
+          <w:tcPr>
+            <w:tcW w:type="dxa" w:w="1517"/>
+            <w:tcBorders>
+              <w:top w:val="single" w:color="808080" w:sz="4"/>
+              <w:left w:val="single" w:color="808080" w:sz="4"/>
+              <w:bottom w:val="single" w:color="808080" w:sz="4"/>
+              <w:right w:val="single" w:color="808080" w:sz="4"/>
+            </w:tcBorders>
+            <w:tcMar>
+              <w:top w:type="dxa" w:w="60"/>
+              <w:left w:type="dxa" w:w="100"/>
+              <w:bottom w:type="dxa" w:w="60"/>
+              <w:right w:type="dxa" w:w="100"/>
+            </w:tcMar>
+            <w:vAlign w:val="center"/>
+          </w:tcPr>
+          <w:p>
+            <w:pPr>
+              <w:spacing w:after="40" w:line="240"/>
+              <w:ind w:firstLine="0"/>
+              <w:jc w:val="left"/>
+            </w:pPr>
+            <w:r>
+              <w:rPr>
+                <w:b/>
+                <w:bCs/>
+                <w:sz w:val="22"/>
+                <w:szCs w:val="22"/>
+              </w:rPr>
+              <w:t xml:space="preserve">[Candidat retenu]</w:t>
+            </w:r>
+          </w:p>
+        </w:tc>
+        <w:tc>
+          <w:tcPr>
+            <w:tcW w:type="dxa" w:w="1167"/>
+            <w:tcBorders>
+              <w:top w:val="single" w:color="808080" w:sz="4"/>
+              <w:left w:val="single" w:color="808080" w:sz="4"/>
+              <w:bottom w:val="single" w:color="808080" w:sz="4"/>
+              <w:right w:val="single" w:color="808080" w:sz="4"/>
+            </w:tcBorders>
+            <w:tcMar>
+              <w:top w:type="dxa" w:w="60"/>
+              <w:left w:type="dxa" w:w="100"/>
+              <w:bottom w:type="dxa" w:w="60"/>
+              <w:right w:type="dxa" w:w="100"/>
+            </w:tcMar>
+            <w:vAlign w:val="center"/>
+          </w:tcPr>
+          <w:p>
+            <w:pPr>
+              <w:spacing w:after="40" w:line="240"/>
+              <w:ind w:firstLine="0"/>
+              <w:jc w:val="left"/>
+            </w:pPr>
+            <w:r>
+              <w:rPr>
+                <w:b w:val="false"/>
+                <w:bCs w:val="false"/>
+                <w:sz w:val="22"/>
+                <w:szCs w:val="22"/>
+              </w:rPr>
+              <w:t xml:space="preserve">[…]</w:t>
+            </w:r>
+          </w:p>
+        </w:tc>
+        <w:tc>
+          <w:tcPr>
+            <w:tcW w:type="dxa" w:w="1750"/>
+            <w:tcBorders>
+              <w:top w:val="single" w:color="808080" w:sz="4"/>
+              <w:left w:val="single" w:color="808080" w:sz="4"/>
+              <w:bottom w:val="single" w:color="808080" w:sz="4"/>
+              <w:right w:val="single" w:color="808080" w:sz="4"/>
+            </w:tcBorders>
+            <w:tcMar>
+              <w:top w:type="dxa" w:w="60"/>
+              <w:left w:type="dxa" w:w="100"/>
+              <w:bottom w:type="dxa" w:w="60"/>
+              <w:right w:type="dxa" w:w="100"/>
+            </w:tcMar>
+            <w:vAlign w:val="center"/>
+          </w:tcPr>
+          <w:p>
+            <w:pPr>
+              <w:spacing w:after="40" w:line="240"/>
+              <w:ind w:firstLine="0"/>
+              <w:jc w:val="left"/>
+            </w:pPr>
+            <w:r>
+              <w:rPr>
+                <w:b w:val="false"/>
+                <w:bCs w:val="false"/>
+                <w:sz w:val="22"/>
+                <w:szCs w:val="22"/>
+              </w:rPr>
+              <w:t xml:space="preserve">[…]</w:t>
+            </w:r>
+          </w:p>
+        </w:tc>
+        <w:tc>
+          <w:tcPr>
+            <w:tcW w:type="dxa" w:w="1750"/>
+            <w:tcBorders>
+              <w:top w:val="single" w:color="808080" w:sz="4"/>
+              <w:left w:val="single" w:color="808080" w:sz="4"/>
+              <w:bottom w:val="single" w:color="808080" w:sz="4"/>
+              <w:right w:val="single" w:color="808080" w:sz="4"/>
+            </w:tcBorders>
+            <w:tcMar>
+              <w:top w:type="dxa" w:w="60"/>
+              <w:left w:type="dxa" w:w="100"/>
+              <w:bottom w:type="dxa" w:w="60"/>
+              <w:right w:type="dxa" w:w="100"/>
+            </w:tcMar>
+            <w:vAlign w:val="center"/>
+          </w:tcPr>
+          <w:p>
+            <w:pPr>
+              <w:spacing w:after="40" w:line="240"/>
+              <w:ind w:firstLine="0"/>
+              <w:jc w:val="left"/>
+            </w:pPr>
+            <w:r>
+              <w:rPr>
+                <w:b w:val="false"/>
+                <w:bCs w:val="false"/>
+                <w:sz w:val="22"/>
+                <w:szCs w:val="22"/>
+              </w:rPr>
+              <w:t xml:space="preserve">[…]</w:t>
+            </w:r>
+          </w:p>
+        </w:tc>
+        <w:tc>
+          <w:tcPr>
+            <w:tcW w:type="dxa" w:w="1752"/>
+            <w:tcBorders>
+              <w:top w:val="single" w:color="808080" w:sz="4"/>
+              <w:left w:val="single" w:color="808080" w:sz="4"/>
+              <w:bottom w:val="single" w:color="808080" w:sz="4"/>
+              <w:right w:val="single" w:color="808080" w:sz="4"/>
+            </w:tcBorders>
+            <w:tcMar>
+              <w:top w:type="dxa" w:w="60"/>
+              <w:left w:type="dxa" w:w="100"/>
+              <w:bottom w:type="dxa" w:w="60"/>
+              <w:right w:type="dxa" w:w="100"/>
+            </w:tcMar>
+            <w:vAlign w:val="center"/>
+          </w:tcPr>
+          <w:p>
+            <w:pPr>
+              <w:spacing w:after="40" w:line="240"/>
+              <w:ind w:firstLine="0"/>
+              <w:jc w:val="left"/>
+            </w:pPr>
+            <w:r>
+              <w:rPr>
+                <w:b w:val="false"/>
+                <w:bCs w:val="false"/>
+                <w:sz w:val="22"/>
+                <w:szCs w:val="22"/>
+              </w:rPr>
+              <w:t xml:space="preserve">[…]</w:t>
+            </w:r>
+          </w:p>
+        </w:tc>
+      </w:tr>
+    </w:tbl>
+    <w:p>
+      <w:pPr>
+        <w:pStyle w:val="Consigne"/>
+      </w:pPr>
+      <w:r>
+        <w:t xml:space="preserve">[Choix et justification (3 à 5 lignes) : pourquoi le candidat retenu, en citant une exigence (EF/ENF). Même tableau pour le web et le mobile.]</w:t>
+      </w:r>
+    </w:p>
+    <w:p>
+      <w:pPr>
+        <w:pStyle w:val="LegendeTableau"/>
+      </w:pPr>
+      <w:r>
+        <w:t xml:space="preserve">Tableau 3.2 : Récapitulatif des outils et technologies utilisés</w:t>
       </w:r>
     </w:p>
     <w:tbl>
@@ -5803,7 +6535,7 @@
         <w:pStyle w:val="LegendeTableau"/>
       </w:pPr>
       <w:r>
-        <w:t xml:space="preserve">Tableau 3.2 : Résultats des tests</w:t>
+        <w:t xml:space="preserve">Tableau 3.3 : Résultats des tests</w:t>
       </w:r>
     </w:p>
     <w:tbl>
@@ -6527,7 +7259,7 @@
         <w:pStyle w:val="LegendeTableau"/>
       </w:pPr>
       <w:r>
-        <w:t xml:space="preserve">Tableau 3.3 : Recette fonctionnelle</w:t>
+        <w:t xml:space="preserve">Tableau 3.4 : Recette fonctionnelle</w:t>
       </w:r>
     </w:p>
     <w:tbl>
@@ -6904,6 +7636,1187 @@
     </w:tbl>
     <w:p>
       <w:pPr>
+        <w:pStyle w:val="Heading2"/>
+      </w:pPr>
+      <w:r>
+        <w:t xml:space="preserve">3.5. Déploiement et estimation des coûts</w:t>
+      </w:r>
+    </w:p>
+    <w:p>
+      <w:pPr>
+        <w:pStyle w:val="Consigne"/>
+      </w:pPr>
+      <w:r>
+        <w:t xml:space="preserve">[Section facultative mais appréciée. Supprimer si non traitée. Dire ce qui est déployé et ce qui est prévu (au conditionnel).]</w:t>
+      </w:r>
+    </w:p>
+    <w:p>
+      <w:pPr>
+        <w:pStyle w:val="Heading3"/>
+      </w:pPr>
+      <w:r>
+        <w:t xml:space="preserve">3.5.1. Déploiement</w:t>
+      </w:r>
+    </w:p>
+    <w:p>
+      <w:pPr>
+        <w:spacing w:after="120" w:line="240"/>
+        <w:ind w:firstLine="0"/>
+      </w:pPr>
+    </w:p>
+    <w:tbl>
+      <w:tblPr>
+        <w:tblW w:type="dxa" w:w="7936"/>
+        <w:jc w:val="center"/>
+        <w:tblBorders>
+          <w:top w:val="single" w:color="auto" w:sz="4"/>
+          <w:left w:val="single" w:color="auto" w:sz="4"/>
+          <w:bottom w:val="single" w:color="auto" w:sz="4"/>
+          <w:right w:val="single" w:color="auto" w:sz="4"/>
+          <w:insideH w:val="single" w:color="auto" w:sz="4"/>
+          <w:insideV w:val="single" w:color="auto" w:sz="4"/>
+        </w:tblBorders>
+      </w:tblPr>
+      <w:tblGrid>
+        <w:gridCol w:w="7936"/>
+      </w:tblGrid>
+      <w:tr>
+        <w:tc>
+          <w:tcPr>
+            <w:tcW w:type="dxa" w:w="7936"/>
+            <w:tcBorders>
+              <w:top w:val="single" w:color="808080" w:sz="4"/>
+              <w:left w:val="single" w:color="808080" w:sz="4"/>
+              <w:bottom w:val="single" w:color="808080" w:sz="4"/>
+              <w:right w:val="single" w:color="808080" w:sz="4"/>
+            </w:tcBorders>
+            <w:tcMar>
+              <w:top w:type="dxa" w:w="120"/>
+              <w:left w:type="dxa" w:w="140"/>
+              <w:bottom w:type="dxa" w:w="120"/>
+              <w:right w:type="dxa" w:w="140"/>
+            </w:tcMar>
+          </w:tcPr>
+          <w:p>
+            <w:pPr>
+              <w:spacing w:line="276"/>
+              <w:ind w:firstLine="0"/>
+              <w:jc w:val="center"/>
+            </w:pPr>
+            <w:r>
+              <w:rPr>
+                <w:i/>
+                <w:iCs/>
+                <w:color w:val="595959"/>
+              </w:rPr>
+              <w:t xml:space="preserve">[Insérer le diagramme de déploiement]</w:t>
+            </w:r>
+          </w:p>
+        </w:tc>
+      </w:tr>
+    </w:tbl>
+    <w:p>
+      <w:pPr>
+        <w:pStyle w:val="LegendeFigure"/>
+      </w:pPr>
+      <w:r>
+        <w:t xml:space="preserve">Figure 3.3 : Diagramme de déploiement</w:t>
+      </w:r>
+    </w:p>
+    <w:p>
+      <w:pPr>
+        <w:pStyle w:val="Consigne"/>
+      </w:pPr>
+      <w:r>
+        <w:t xml:space="preserve">[Une puce par composant (base de données, API, front web, application mobile et sa publication), avec l'hébergeur et ce qu'il apporte.]</w:t>
+      </w:r>
+    </w:p>
+    <w:p>
+      <w:pPr>
+        <w:pStyle w:val="Heading3"/>
+      </w:pPr>
+      <w:r>
+        <w:t xml:space="preserve">3.5.2. Estimation des coûts</w:t>
+      </w:r>
+    </w:p>
+    <w:p>
+      <w:pPr>
+        <w:pStyle w:val="LegendeTableau"/>
+      </w:pPr>
+      <w:r>
+        <w:t xml:space="preserve">Tableau 3.5 : Estimation des coûts d'exploitation</w:t>
+      </w:r>
+    </w:p>
+    <w:tbl>
+      <w:tblPr>
+        <w:tblW w:type="dxa" w:w="7936"/>
+        <w:tblBorders>
+          <w:top w:val="single" w:color="auto" w:sz="4"/>
+          <w:left w:val="single" w:color="auto" w:sz="4"/>
+          <w:bottom w:val="single" w:color="auto" w:sz="4"/>
+          <w:right w:val="single" w:color="auto" w:sz="4"/>
+          <w:insideH w:val="single" w:color="auto" w:sz="4"/>
+          <w:insideV w:val="single" w:color="auto" w:sz="4"/>
+        </w:tblBorders>
+      </w:tblPr>
+      <w:tblGrid>
+        <w:gridCol w:w="1637"/>
+        <w:gridCol w:w="1259"/>
+        <w:gridCol w:w="1259"/>
+        <w:gridCol w:w="1259"/>
+        <w:gridCol w:w="1133"/>
+        <w:gridCol w:w="1389"/>
+      </w:tblGrid>
+      <w:tr>
+        <w:trPr>
+          <w:tblHeader/>
+        </w:trPr>
+        <w:tc>
+          <w:tcPr>
+            <w:tcW w:type="dxa" w:w="1637"/>
+            <w:tcBorders>
+              <w:top w:val="single" w:color="808080" w:sz="4"/>
+              <w:left w:val="single" w:color="808080" w:sz="4"/>
+              <w:bottom w:val="single" w:color="808080" w:sz="4"/>
+              <w:right w:val="single" w:color="808080" w:sz="4"/>
+            </w:tcBorders>
+            <w:shd w:fill="D9E2F3" w:color="auto" w:val="clear"/>
+            <w:tcMar>
+              <w:top w:type="dxa" w:w="60"/>
+              <w:left w:type="dxa" w:w="100"/>
+              <w:bottom w:type="dxa" w:w="60"/>
+              <w:right w:type="dxa" w:w="100"/>
+            </w:tcMar>
+            <w:vAlign w:val="center"/>
+          </w:tcPr>
+          <w:p>
+            <w:pPr>
+              <w:spacing w:after="40" w:line="240"/>
+              <w:ind w:firstLine="0"/>
+              <w:jc w:val="left"/>
+            </w:pPr>
+            <w:r>
+              <w:rPr>
+                <w:b/>
+                <w:bCs/>
+                <w:sz w:val="22"/>
+                <w:szCs w:val="22"/>
+              </w:rPr>
+              <w:t xml:space="preserve">Composante</w:t>
+            </w:r>
+          </w:p>
+        </w:tc>
+        <w:tc>
+          <w:tcPr>
+            <w:tcW w:type="dxa" w:w="1259"/>
+            <w:tcBorders>
+              <w:top w:val="single" w:color="808080" w:sz="4"/>
+              <w:left w:val="single" w:color="808080" w:sz="4"/>
+              <w:bottom w:val="single" w:color="808080" w:sz="4"/>
+              <w:right w:val="single" w:color="808080" w:sz="4"/>
+            </w:tcBorders>
+            <w:shd w:fill="D9E2F3" w:color="auto" w:val="clear"/>
+            <w:tcMar>
+              <w:top w:type="dxa" w:w="60"/>
+              <w:left w:type="dxa" w:w="100"/>
+              <w:bottom w:type="dxa" w:w="60"/>
+              <w:right w:type="dxa" w:w="100"/>
+            </w:tcMar>
+            <w:vAlign w:val="center"/>
+          </w:tcPr>
+          <w:p>
+            <w:pPr>
+              <w:spacing w:after="40" w:line="240"/>
+              <w:ind w:firstLine="0"/>
+              <w:jc w:val="left"/>
+            </w:pPr>
+            <w:r>
+              <w:rPr>
+                <w:b/>
+                <w:bCs/>
+                <w:sz w:val="22"/>
+                <w:szCs w:val="22"/>
+              </w:rPr>
+              <w:t xml:space="preserve">Service</w:t>
+            </w:r>
+          </w:p>
+        </w:tc>
+        <w:tc>
+          <w:tcPr>
+            <w:tcW w:type="dxa" w:w="1259"/>
+            <w:tcBorders>
+              <w:top w:val="single" w:color="808080" w:sz="4"/>
+              <w:left w:val="single" w:color="808080" w:sz="4"/>
+              <w:bottom w:val="single" w:color="808080" w:sz="4"/>
+              <w:right w:val="single" w:color="808080" w:sz="4"/>
+            </w:tcBorders>
+            <w:shd w:fill="D9E2F3" w:color="auto" w:val="clear"/>
+            <w:tcMar>
+              <w:top w:type="dxa" w:w="60"/>
+              <w:left w:type="dxa" w:w="100"/>
+              <w:bottom w:type="dxa" w:w="60"/>
+              <w:right w:type="dxa" w:w="100"/>
+            </w:tcMar>
+            <w:vAlign w:val="center"/>
+          </w:tcPr>
+          <w:p>
+            <w:pPr>
+              <w:spacing w:after="40" w:line="240"/>
+              <w:ind w:firstLine="0"/>
+              <w:jc w:val="left"/>
+            </w:pPr>
+            <w:r>
+              <w:rPr>
+                <w:b/>
+                <w:bCs/>
+                <w:sz w:val="22"/>
+                <w:szCs w:val="22"/>
+              </w:rPr>
+              <w:t xml:space="preserve">Offre retenue</w:t>
+            </w:r>
+          </w:p>
+        </w:tc>
+        <w:tc>
+          <w:tcPr>
+            <w:tcW w:type="dxa" w:w="1259"/>
+            <w:tcBorders>
+              <w:top w:val="single" w:color="808080" w:sz="4"/>
+              <w:left w:val="single" w:color="808080" w:sz="4"/>
+              <w:bottom w:val="single" w:color="808080" w:sz="4"/>
+              <w:right w:val="single" w:color="808080" w:sz="4"/>
+            </w:tcBorders>
+            <w:shd w:fill="D9E2F3" w:color="auto" w:val="clear"/>
+            <w:tcMar>
+              <w:top w:type="dxa" w:w="60"/>
+              <w:left w:type="dxa" w:w="100"/>
+              <w:bottom w:type="dxa" w:w="60"/>
+              <w:right w:type="dxa" w:w="100"/>
+            </w:tcMar>
+            <w:vAlign w:val="center"/>
+          </w:tcPr>
+          <w:p>
+            <w:pPr>
+              <w:spacing w:after="40" w:line="240"/>
+              <w:ind w:firstLine="0"/>
+              <w:jc w:val="left"/>
+            </w:pPr>
+            <w:r>
+              <w:rPr>
+                <w:b/>
+                <w:bCs/>
+                <w:sz w:val="22"/>
+                <w:szCs w:val="22"/>
+              </w:rPr>
+              <w:t xml:space="preserve">Périodicité</w:t>
+            </w:r>
+          </w:p>
+        </w:tc>
+        <w:tc>
+          <w:tcPr>
+            <w:tcW w:type="dxa" w:w="1133"/>
+            <w:tcBorders>
+              <w:top w:val="single" w:color="808080" w:sz="4"/>
+              <w:left w:val="single" w:color="808080" w:sz="4"/>
+              <w:bottom w:val="single" w:color="808080" w:sz="4"/>
+              <w:right w:val="single" w:color="808080" w:sz="4"/>
+            </w:tcBorders>
+            <w:shd w:fill="D9E2F3" w:color="auto" w:val="clear"/>
+            <w:tcMar>
+              <w:top w:type="dxa" w:w="60"/>
+              <w:left w:type="dxa" w:w="100"/>
+              <w:bottom w:type="dxa" w:w="60"/>
+              <w:right w:type="dxa" w:w="100"/>
+            </w:tcMar>
+            <w:vAlign w:val="center"/>
+          </w:tcPr>
+          <w:p>
+            <w:pPr>
+              <w:spacing w:after="40" w:line="240"/>
+              <w:ind w:firstLine="0"/>
+              <w:jc w:val="left"/>
+            </w:pPr>
+            <w:r>
+              <w:rPr>
+                <w:b/>
+                <w:bCs/>
+                <w:sz w:val="22"/>
+                <w:szCs w:val="22"/>
+              </w:rPr>
+              <w:t xml:space="preserve">Coût (FCFA)</w:t>
+            </w:r>
+          </w:p>
+        </w:tc>
+        <w:tc>
+          <w:tcPr>
+            <w:tcW w:type="dxa" w:w="1389"/>
+            <w:tcBorders>
+              <w:top w:val="single" w:color="808080" w:sz="4"/>
+              <w:left w:val="single" w:color="808080" w:sz="4"/>
+              <w:bottom w:val="single" w:color="808080" w:sz="4"/>
+              <w:right w:val="single" w:color="808080" w:sz="4"/>
+            </w:tcBorders>
+            <w:shd w:fill="D9E2F3" w:color="auto" w:val="clear"/>
+            <w:tcMar>
+              <w:top w:type="dxa" w:w="60"/>
+              <w:left w:type="dxa" w:w="100"/>
+              <w:bottom w:type="dxa" w:w="60"/>
+              <w:right w:type="dxa" w:w="100"/>
+            </w:tcMar>
+            <w:vAlign w:val="center"/>
+          </w:tcPr>
+          <w:p>
+            <w:pPr>
+              <w:spacing w:after="40" w:line="240"/>
+              <w:ind w:firstLine="0"/>
+              <w:jc w:val="left"/>
+            </w:pPr>
+            <w:r>
+              <w:rPr>
+                <w:b/>
+                <w:bCs/>
+                <w:sz w:val="22"/>
+                <w:szCs w:val="22"/>
+              </w:rPr>
+              <w:t xml:space="preserve">Équivalent mensuel (FCFA)</w:t>
+            </w:r>
+          </w:p>
+        </w:tc>
+      </w:tr>
+      <w:tr>
+        <w:tc>
+          <w:tcPr>
+            <w:tcW w:type="dxa" w:w="1637"/>
+            <w:tcBorders>
+              <w:top w:val="single" w:color="808080" w:sz="4"/>
+              <w:left w:val="single" w:color="808080" w:sz="4"/>
+              <w:bottom w:val="single" w:color="808080" w:sz="4"/>
+              <w:right w:val="single" w:color="808080" w:sz="4"/>
+            </w:tcBorders>
+            <w:tcMar>
+              <w:top w:type="dxa" w:w="60"/>
+              <w:left w:type="dxa" w:w="100"/>
+              <w:bottom w:type="dxa" w:w="60"/>
+              <w:right w:type="dxa" w:w="100"/>
+            </w:tcMar>
+            <w:vAlign w:val="center"/>
+          </w:tcPr>
+          <w:p>
+            <w:pPr>
+              <w:spacing w:after="40" w:line="240"/>
+              <w:ind w:firstLine="0"/>
+              <w:jc w:val="left"/>
+            </w:pPr>
+            <w:r>
+              <w:rPr>
+                <w:b w:val="false"/>
+                <w:bCs w:val="false"/>
+                <w:sz w:val="22"/>
+                <w:szCs w:val="22"/>
+              </w:rPr>
+              <w:t xml:space="preserve">[Base de données]</w:t>
+            </w:r>
+          </w:p>
+        </w:tc>
+        <w:tc>
+          <w:tcPr>
+            <w:tcW w:type="dxa" w:w="1259"/>
+            <w:tcBorders>
+              <w:top w:val="single" w:color="808080" w:sz="4"/>
+              <w:left w:val="single" w:color="808080" w:sz="4"/>
+              <w:bottom w:val="single" w:color="808080" w:sz="4"/>
+              <w:right w:val="single" w:color="808080" w:sz="4"/>
+            </w:tcBorders>
+            <w:tcMar>
+              <w:top w:type="dxa" w:w="60"/>
+              <w:left w:type="dxa" w:w="100"/>
+              <w:bottom w:type="dxa" w:w="60"/>
+              <w:right w:type="dxa" w:w="100"/>
+            </w:tcMar>
+            <w:vAlign w:val="center"/>
+          </w:tcPr>
+          <w:p>
+            <w:pPr>
+              <w:spacing w:after="40" w:line="240"/>
+              <w:ind w:firstLine="0"/>
+              <w:jc w:val="left"/>
+            </w:pPr>
+            <w:r>
+              <w:rPr>
+                <w:b w:val="false"/>
+                <w:bCs w:val="false"/>
+                <w:sz w:val="22"/>
+                <w:szCs w:val="22"/>
+              </w:rPr>
+              <w:t xml:space="preserve">[…]</w:t>
+            </w:r>
+          </w:p>
+        </w:tc>
+        <w:tc>
+          <w:tcPr>
+            <w:tcW w:type="dxa" w:w="1259"/>
+            <w:tcBorders>
+              <w:top w:val="single" w:color="808080" w:sz="4"/>
+              <w:left w:val="single" w:color="808080" w:sz="4"/>
+              <w:bottom w:val="single" w:color="808080" w:sz="4"/>
+              <w:right w:val="single" w:color="808080" w:sz="4"/>
+            </w:tcBorders>
+            <w:tcMar>
+              <w:top w:type="dxa" w:w="60"/>
+              <w:left w:type="dxa" w:w="100"/>
+              <w:bottom w:type="dxa" w:w="60"/>
+              <w:right w:type="dxa" w:w="100"/>
+            </w:tcMar>
+            <w:vAlign w:val="center"/>
+          </w:tcPr>
+          <w:p>
+            <w:pPr>
+              <w:spacing w:after="40" w:line="240"/>
+              <w:ind w:firstLine="0"/>
+              <w:jc w:val="left"/>
+            </w:pPr>
+            <w:r>
+              <w:rPr>
+                <w:b w:val="false"/>
+                <w:bCs w:val="false"/>
+                <w:sz w:val="22"/>
+                <w:szCs w:val="22"/>
+              </w:rPr>
+              <w:t xml:space="preserve">[…]</w:t>
+            </w:r>
+          </w:p>
+        </w:tc>
+        <w:tc>
+          <w:tcPr>
+            <w:tcW w:type="dxa" w:w="1259"/>
+            <w:tcBorders>
+              <w:top w:val="single" w:color="808080" w:sz="4"/>
+              <w:left w:val="single" w:color="808080" w:sz="4"/>
+              <w:bottom w:val="single" w:color="808080" w:sz="4"/>
+              <w:right w:val="single" w:color="808080" w:sz="4"/>
+            </w:tcBorders>
+            <w:tcMar>
+              <w:top w:type="dxa" w:w="60"/>
+              <w:left w:type="dxa" w:w="100"/>
+              <w:bottom w:type="dxa" w:w="60"/>
+              <w:right w:type="dxa" w:w="100"/>
+            </w:tcMar>
+            <w:vAlign w:val="center"/>
+          </w:tcPr>
+          <w:p>
+            <w:pPr>
+              <w:spacing w:after="40" w:line="240"/>
+              <w:ind w:firstLine="0"/>
+              <w:jc w:val="left"/>
+            </w:pPr>
+            <w:r>
+              <w:rPr>
+                <w:b w:val="false"/>
+                <w:bCs w:val="false"/>
+                <w:sz w:val="22"/>
+                <w:szCs w:val="22"/>
+              </w:rPr>
+              <w:t xml:space="preserve">Mensuelle</w:t>
+            </w:r>
+          </w:p>
+        </w:tc>
+        <w:tc>
+          <w:tcPr>
+            <w:tcW w:type="dxa" w:w="1133"/>
+            <w:tcBorders>
+              <w:top w:val="single" w:color="808080" w:sz="4"/>
+              <w:left w:val="single" w:color="808080" w:sz="4"/>
+              <w:bottom w:val="single" w:color="808080" w:sz="4"/>
+              <w:right w:val="single" w:color="808080" w:sz="4"/>
+            </w:tcBorders>
+            <w:tcMar>
+              <w:top w:type="dxa" w:w="60"/>
+              <w:left w:type="dxa" w:w="100"/>
+              <w:bottom w:type="dxa" w:w="60"/>
+              <w:right w:type="dxa" w:w="100"/>
+            </w:tcMar>
+            <w:vAlign w:val="center"/>
+          </w:tcPr>
+          <w:p>
+            <w:pPr>
+              <w:spacing w:after="40" w:line="240"/>
+              <w:ind w:firstLine="0"/>
+              <w:jc w:val="left"/>
+            </w:pPr>
+            <w:r>
+              <w:rPr>
+                <w:b w:val="false"/>
+                <w:bCs w:val="false"/>
+                <w:sz w:val="22"/>
+                <w:szCs w:val="22"/>
+              </w:rPr>
+              <w:t xml:space="preserve">[…]</w:t>
+            </w:r>
+          </w:p>
+        </w:tc>
+        <w:tc>
+          <w:tcPr>
+            <w:tcW w:type="dxa" w:w="1389"/>
+            <w:tcBorders>
+              <w:top w:val="single" w:color="808080" w:sz="4"/>
+              <w:left w:val="single" w:color="808080" w:sz="4"/>
+              <w:bottom w:val="single" w:color="808080" w:sz="4"/>
+              <w:right w:val="single" w:color="808080" w:sz="4"/>
+            </w:tcBorders>
+            <w:tcMar>
+              <w:top w:type="dxa" w:w="60"/>
+              <w:left w:type="dxa" w:w="100"/>
+              <w:bottom w:type="dxa" w:w="60"/>
+              <w:right w:type="dxa" w:w="100"/>
+            </w:tcMar>
+            <w:vAlign w:val="center"/>
+          </w:tcPr>
+          <w:p>
+            <w:pPr>
+              <w:spacing w:after="40" w:line="240"/>
+              <w:ind w:firstLine="0"/>
+              <w:jc w:val="left"/>
+            </w:pPr>
+            <w:r>
+              <w:rPr>
+                <w:b w:val="false"/>
+                <w:bCs w:val="false"/>
+                <w:sz w:val="22"/>
+                <w:szCs w:val="22"/>
+              </w:rPr>
+              <w:t xml:space="preserve">[…]</w:t>
+            </w:r>
+          </w:p>
+        </w:tc>
+      </w:tr>
+      <w:tr>
+        <w:tc>
+          <w:tcPr>
+            <w:tcW w:type="dxa" w:w="1637"/>
+            <w:tcBorders>
+              <w:top w:val="single" w:color="808080" w:sz="4"/>
+              <w:left w:val="single" w:color="808080" w:sz="4"/>
+              <w:bottom w:val="single" w:color="808080" w:sz="4"/>
+              <w:right w:val="single" w:color="808080" w:sz="4"/>
+            </w:tcBorders>
+            <w:tcMar>
+              <w:top w:type="dxa" w:w="60"/>
+              <w:left w:type="dxa" w:w="100"/>
+              <w:bottom w:type="dxa" w:w="60"/>
+              <w:right w:type="dxa" w:w="100"/>
+            </w:tcMar>
+            <w:vAlign w:val="center"/>
+          </w:tcPr>
+          <w:p>
+            <w:pPr>
+              <w:spacing w:after="40" w:line="240"/>
+              <w:ind w:firstLine="0"/>
+              <w:jc w:val="left"/>
+            </w:pPr>
+            <w:r>
+              <w:rPr>
+                <w:b w:val="false"/>
+                <w:bCs w:val="false"/>
+                <w:sz w:val="22"/>
+                <w:szCs w:val="22"/>
+              </w:rPr>
+              <w:t xml:space="preserve">[Nom de domaine]</w:t>
+            </w:r>
+          </w:p>
+        </w:tc>
+        <w:tc>
+          <w:tcPr>
+            <w:tcW w:type="dxa" w:w="1259"/>
+            <w:tcBorders>
+              <w:top w:val="single" w:color="808080" w:sz="4"/>
+              <w:left w:val="single" w:color="808080" w:sz="4"/>
+              <w:bottom w:val="single" w:color="808080" w:sz="4"/>
+              <w:right w:val="single" w:color="808080" w:sz="4"/>
+            </w:tcBorders>
+            <w:tcMar>
+              <w:top w:type="dxa" w:w="60"/>
+              <w:left w:type="dxa" w:w="100"/>
+              <w:bottom w:type="dxa" w:w="60"/>
+              <w:right w:type="dxa" w:w="100"/>
+            </w:tcMar>
+            <w:vAlign w:val="center"/>
+          </w:tcPr>
+          <w:p>
+            <w:pPr>
+              <w:spacing w:after="40" w:line="240"/>
+              <w:ind w:firstLine="0"/>
+              <w:jc w:val="left"/>
+            </w:pPr>
+            <w:r>
+              <w:rPr>
+                <w:b w:val="false"/>
+                <w:bCs w:val="false"/>
+                <w:sz w:val="22"/>
+                <w:szCs w:val="22"/>
+              </w:rPr>
+              <w:t xml:space="preserve">[…]</w:t>
+            </w:r>
+          </w:p>
+        </w:tc>
+        <w:tc>
+          <w:tcPr>
+            <w:tcW w:type="dxa" w:w="1259"/>
+            <w:tcBorders>
+              <w:top w:val="single" w:color="808080" w:sz="4"/>
+              <w:left w:val="single" w:color="808080" w:sz="4"/>
+              <w:bottom w:val="single" w:color="808080" w:sz="4"/>
+              <w:right w:val="single" w:color="808080" w:sz="4"/>
+            </w:tcBorders>
+            <w:tcMar>
+              <w:top w:type="dxa" w:w="60"/>
+              <w:left w:type="dxa" w:w="100"/>
+              <w:bottom w:type="dxa" w:w="60"/>
+              <w:right w:type="dxa" w:w="100"/>
+            </w:tcMar>
+            <w:vAlign w:val="center"/>
+          </w:tcPr>
+          <w:p>
+            <w:pPr>
+              <w:spacing w:after="40" w:line="240"/>
+              <w:ind w:firstLine="0"/>
+              <w:jc w:val="left"/>
+            </w:pPr>
+            <w:r>
+              <w:rPr>
+                <w:b w:val="false"/>
+                <w:bCs w:val="false"/>
+                <w:sz w:val="22"/>
+                <w:szCs w:val="22"/>
+              </w:rPr>
+              <w:t xml:space="preserve">[…]</w:t>
+            </w:r>
+          </w:p>
+        </w:tc>
+        <w:tc>
+          <w:tcPr>
+            <w:tcW w:type="dxa" w:w="1259"/>
+            <w:tcBorders>
+              <w:top w:val="single" w:color="808080" w:sz="4"/>
+              <w:left w:val="single" w:color="808080" w:sz="4"/>
+              <w:bottom w:val="single" w:color="808080" w:sz="4"/>
+              <w:right w:val="single" w:color="808080" w:sz="4"/>
+            </w:tcBorders>
+            <w:tcMar>
+              <w:top w:type="dxa" w:w="60"/>
+              <w:left w:type="dxa" w:w="100"/>
+              <w:bottom w:type="dxa" w:w="60"/>
+              <w:right w:type="dxa" w:w="100"/>
+            </w:tcMar>
+            <w:vAlign w:val="center"/>
+          </w:tcPr>
+          <w:p>
+            <w:pPr>
+              <w:spacing w:after="40" w:line="240"/>
+              <w:ind w:firstLine="0"/>
+              <w:jc w:val="left"/>
+            </w:pPr>
+            <w:r>
+              <w:rPr>
+                <w:b w:val="false"/>
+                <w:bCs w:val="false"/>
+                <w:sz w:val="22"/>
+                <w:szCs w:val="22"/>
+              </w:rPr>
+              <w:t xml:space="preserve">Annuelle</w:t>
+            </w:r>
+          </w:p>
+        </w:tc>
+        <w:tc>
+          <w:tcPr>
+            <w:tcW w:type="dxa" w:w="1133"/>
+            <w:tcBorders>
+              <w:top w:val="single" w:color="808080" w:sz="4"/>
+              <w:left w:val="single" w:color="808080" w:sz="4"/>
+              <w:bottom w:val="single" w:color="808080" w:sz="4"/>
+              <w:right w:val="single" w:color="808080" w:sz="4"/>
+            </w:tcBorders>
+            <w:tcMar>
+              <w:top w:type="dxa" w:w="60"/>
+              <w:left w:type="dxa" w:w="100"/>
+              <w:bottom w:type="dxa" w:w="60"/>
+              <w:right w:type="dxa" w:w="100"/>
+            </w:tcMar>
+            <w:vAlign w:val="center"/>
+          </w:tcPr>
+          <w:p>
+            <w:pPr>
+              <w:spacing w:after="40" w:line="240"/>
+              <w:ind w:firstLine="0"/>
+              <w:jc w:val="left"/>
+            </w:pPr>
+            <w:r>
+              <w:rPr>
+                <w:b w:val="false"/>
+                <w:bCs w:val="false"/>
+                <w:sz w:val="22"/>
+                <w:szCs w:val="22"/>
+              </w:rPr>
+              <w:t xml:space="preserve">[…]</w:t>
+            </w:r>
+          </w:p>
+        </w:tc>
+        <w:tc>
+          <w:tcPr>
+            <w:tcW w:type="dxa" w:w="1389"/>
+            <w:tcBorders>
+              <w:top w:val="single" w:color="808080" w:sz="4"/>
+              <w:left w:val="single" w:color="808080" w:sz="4"/>
+              <w:bottom w:val="single" w:color="808080" w:sz="4"/>
+              <w:right w:val="single" w:color="808080" w:sz="4"/>
+            </w:tcBorders>
+            <w:tcMar>
+              <w:top w:type="dxa" w:w="60"/>
+              <w:left w:type="dxa" w:w="100"/>
+              <w:bottom w:type="dxa" w:w="60"/>
+              <w:right w:type="dxa" w:w="100"/>
+            </w:tcMar>
+            <w:vAlign w:val="center"/>
+          </w:tcPr>
+          <w:p>
+            <w:pPr>
+              <w:spacing w:after="40" w:line="240"/>
+              <w:ind w:firstLine="0"/>
+              <w:jc w:val="left"/>
+            </w:pPr>
+            <w:r>
+              <w:rPr>
+                <w:b w:val="false"/>
+                <w:bCs w:val="false"/>
+                <w:sz w:val="22"/>
+                <w:szCs w:val="22"/>
+              </w:rPr>
+              <w:t xml:space="preserve">[…]</w:t>
+            </w:r>
+          </w:p>
+        </w:tc>
+      </w:tr>
+      <w:tr>
+        <w:tc>
+          <w:tcPr>
+            <w:tcW w:type="dxa" w:w="1637"/>
+            <w:tcBorders>
+              <w:top w:val="single" w:color="808080" w:sz="4"/>
+              <w:left w:val="single" w:color="808080" w:sz="4"/>
+              <w:bottom w:val="single" w:color="808080" w:sz="4"/>
+              <w:right w:val="single" w:color="808080" w:sz="4"/>
+            </w:tcBorders>
+            <w:tcMar>
+              <w:top w:type="dxa" w:w="60"/>
+              <w:left w:type="dxa" w:w="100"/>
+              <w:bottom w:type="dxa" w:w="60"/>
+              <w:right w:type="dxa" w:w="100"/>
+            </w:tcMar>
+            <w:vAlign w:val="center"/>
+          </w:tcPr>
+          <w:p>
+            <w:pPr>
+              <w:spacing w:after="40" w:line="240"/>
+              <w:ind w:firstLine="0"/>
+              <w:jc w:val="left"/>
+            </w:pPr>
+            <w:r>
+              <w:rPr>
+                <w:b w:val="false"/>
+                <w:bCs w:val="false"/>
+                <w:sz w:val="22"/>
+                <w:szCs w:val="22"/>
+              </w:rPr>
+              <w:t xml:space="preserve">[Compte Play Store]</w:t>
+            </w:r>
+          </w:p>
+        </w:tc>
+        <w:tc>
+          <w:tcPr>
+            <w:tcW w:type="dxa" w:w="1259"/>
+            <w:tcBorders>
+              <w:top w:val="single" w:color="808080" w:sz="4"/>
+              <w:left w:val="single" w:color="808080" w:sz="4"/>
+              <w:bottom w:val="single" w:color="808080" w:sz="4"/>
+              <w:right w:val="single" w:color="808080" w:sz="4"/>
+            </w:tcBorders>
+            <w:tcMar>
+              <w:top w:type="dxa" w:w="60"/>
+              <w:left w:type="dxa" w:w="100"/>
+              <w:bottom w:type="dxa" w:w="60"/>
+              <w:right w:type="dxa" w:w="100"/>
+            </w:tcMar>
+            <w:vAlign w:val="center"/>
+          </w:tcPr>
+          <w:p>
+            <w:pPr>
+              <w:spacing w:after="40" w:line="240"/>
+              <w:ind w:firstLine="0"/>
+              <w:jc w:val="left"/>
+            </w:pPr>
+            <w:r>
+              <w:rPr>
+                <w:b w:val="false"/>
+                <w:bCs w:val="false"/>
+                <w:sz w:val="22"/>
+                <w:szCs w:val="22"/>
+              </w:rPr>
+              <w:t xml:space="preserve">Google</w:t>
+            </w:r>
+          </w:p>
+        </w:tc>
+        <w:tc>
+          <w:tcPr>
+            <w:tcW w:type="dxa" w:w="1259"/>
+            <w:tcBorders>
+              <w:top w:val="single" w:color="808080" w:sz="4"/>
+              <w:left w:val="single" w:color="808080" w:sz="4"/>
+              <w:bottom w:val="single" w:color="808080" w:sz="4"/>
+              <w:right w:val="single" w:color="808080" w:sz="4"/>
+            </w:tcBorders>
+            <w:tcMar>
+              <w:top w:type="dxa" w:w="60"/>
+              <w:left w:type="dxa" w:w="100"/>
+              <w:bottom w:type="dxa" w:w="60"/>
+              <w:right w:type="dxa" w:w="100"/>
+            </w:tcMar>
+            <w:vAlign w:val="center"/>
+          </w:tcPr>
+          <w:p>
+            <w:pPr>
+              <w:spacing w:after="40" w:line="240"/>
+              <w:ind w:firstLine="0"/>
+              <w:jc w:val="left"/>
+            </w:pPr>
+            <w:r>
+              <w:rPr>
+                <w:b w:val="false"/>
+                <w:bCs w:val="false"/>
+                <w:sz w:val="22"/>
+                <w:szCs w:val="22"/>
+              </w:rPr>
+              <w:t xml:space="preserve">—</w:t>
+            </w:r>
+          </w:p>
+        </w:tc>
+        <w:tc>
+          <w:tcPr>
+            <w:tcW w:type="dxa" w:w="1259"/>
+            <w:tcBorders>
+              <w:top w:val="single" w:color="808080" w:sz="4"/>
+              <w:left w:val="single" w:color="808080" w:sz="4"/>
+              <w:bottom w:val="single" w:color="808080" w:sz="4"/>
+              <w:right w:val="single" w:color="808080" w:sz="4"/>
+            </w:tcBorders>
+            <w:tcMar>
+              <w:top w:type="dxa" w:w="60"/>
+              <w:left w:type="dxa" w:w="100"/>
+              <w:bottom w:type="dxa" w:w="60"/>
+              <w:right w:type="dxa" w:w="100"/>
+            </w:tcMar>
+            <w:vAlign w:val="center"/>
+          </w:tcPr>
+          <w:p>
+            <w:pPr>
+              <w:spacing w:after="40" w:line="240"/>
+              <w:ind w:firstLine="0"/>
+              <w:jc w:val="left"/>
+            </w:pPr>
+            <w:r>
+              <w:rPr>
+                <w:b w:val="false"/>
+                <w:bCs w:val="false"/>
+                <w:sz w:val="22"/>
+                <w:szCs w:val="22"/>
+              </w:rPr>
+              <w:t xml:space="preserve">Unique</w:t>
+            </w:r>
+          </w:p>
+        </w:tc>
+        <w:tc>
+          <w:tcPr>
+            <w:tcW w:type="dxa" w:w="1133"/>
+            <w:tcBorders>
+              <w:top w:val="single" w:color="808080" w:sz="4"/>
+              <w:left w:val="single" w:color="808080" w:sz="4"/>
+              <w:bottom w:val="single" w:color="808080" w:sz="4"/>
+              <w:right w:val="single" w:color="808080" w:sz="4"/>
+            </w:tcBorders>
+            <w:tcMar>
+              <w:top w:type="dxa" w:w="60"/>
+              <w:left w:type="dxa" w:w="100"/>
+              <w:bottom w:type="dxa" w:w="60"/>
+              <w:right w:type="dxa" w:w="100"/>
+            </w:tcMar>
+            <w:vAlign w:val="center"/>
+          </w:tcPr>
+          <w:p>
+            <w:pPr>
+              <w:spacing w:after="40" w:line="240"/>
+              <w:ind w:firstLine="0"/>
+              <w:jc w:val="left"/>
+            </w:pPr>
+            <w:r>
+              <w:rPr>
+                <w:b w:val="false"/>
+                <w:bCs w:val="false"/>
+                <w:sz w:val="22"/>
+                <w:szCs w:val="22"/>
+              </w:rPr>
+              <w:t xml:space="preserve">[…]</w:t>
+            </w:r>
+          </w:p>
+        </w:tc>
+        <w:tc>
+          <w:tcPr>
+            <w:tcW w:type="dxa" w:w="1389"/>
+            <w:tcBorders>
+              <w:top w:val="single" w:color="808080" w:sz="4"/>
+              <w:left w:val="single" w:color="808080" w:sz="4"/>
+              <w:bottom w:val="single" w:color="808080" w:sz="4"/>
+              <w:right w:val="single" w:color="808080" w:sz="4"/>
+            </w:tcBorders>
+            <w:tcMar>
+              <w:top w:type="dxa" w:w="60"/>
+              <w:left w:type="dxa" w:w="100"/>
+              <w:bottom w:type="dxa" w:w="60"/>
+              <w:right w:type="dxa" w:w="100"/>
+            </w:tcMar>
+            <w:vAlign w:val="center"/>
+          </w:tcPr>
+          <w:p>
+            <w:pPr>
+              <w:spacing w:after="40" w:line="240"/>
+              <w:ind w:firstLine="0"/>
+              <w:jc w:val="left"/>
+            </w:pPr>
+            <w:r>
+              <w:rPr>
+                <w:b w:val="false"/>
+                <w:bCs w:val="false"/>
+                <w:sz w:val="22"/>
+                <w:szCs w:val="22"/>
+              </w:rPr>
+              <w:t xml:space="preserve">—</w:t>
+            </w:r>
+          </w:p>
+        </w:tc>
+      </w:tr>
+      <w:tr>
+        <w:tc>
+          <w:tcPr>
+            <w:tcW w:type="dxa" w:w="1637"/>
+            <w:tcBorders>
+              <w:top w:val="single" w:color="808080" w:sz="4"/>
+              <w:left w:val="single" w:color="808080" w:sz="4"/>
+              <w:bottom w:val="single" w:color="808080" w:sz="4"/>
+              <w:right w:val="single" w:color="808080" w:sz="4"/>
+            </w:tcBorders>
+            <w:tcMar>
+              <w:top w:type="dxa" w:w="60"/>
+              <w:left w:type="dxa" w:w="100"/>
+              <w:bottom w:type="dxa" w:w="60"/>
+              <w:right w:type="dxa" w:w="100"/>
+            </w:tcMar>
+            <w:vAlign w:val="center"/>
+          </w:tcPr>
+          <w:p>
+            <w:pPr>
+              <w:spacing w:after="40" w:line="240"/>
+              <w:ind w:firstLine="0"/>
+              <w:jc w:val="left"/>
+            </w:pPr>
+            <w:r>
+              <w:rPr>
+                <w:b w:val="false"/>
+                <w:bCs w:val="false"/>
+                <w:sz w:val="22"/>
+                <w:szCs w:val="22"/>
+              </w:rPr>
+              <w:t xml:space="preserve">[Passerelle de paiement]</w:t>
+            </w:r>
+          </w:p>
+        </w:tc>
+        <w:tc>
+          <w:tcPr>
+            <w:tcW w:type="dxa" w:w="1259"/>
+            <w:tcBorders>
+              <w:top w:val="single" w:color="808080" w:sz="4"/>
+              <w:left w:val="single" w:color="808080" w:sz="4"/>
+              <w:bottom w:val="single" w:color="808080" w:sz="4"/>
+              <w:right w:val="single" w:color="808080" w:sz="4"/>
+            </w:tcBorders>
+            <w:tcMar>
+              <w:top w:type="dxa" w:w="60"/>
+              <w:left w:type="dxa" w:w="100"/>
+              <w:bottom w:type="dxa" w:w="60"/>
+              <w:right w:type="dxa" w:w="100"/>
+            </w:tcMar>
+            <w:vAlign w:val="center"/>
+          </w:tcPr>
+          <w:p>
+            <w:pPr>
+              <w:spacing w:after="40" w:line="240"/>
+              <w:ind w:firstLine="0"/>
+              <w:jc w:val="left"/>
+            </w:pPr>
+            <w:r>
+              <w:rPr>
+                <w:b w:val="false"/>
+                <w:bCs w:val="false"/>
+                <w:sz w:val="22"/>
+                <w:szCs w:val="22"/>
+              </w:rPr>
+              <w:t xml:space="preserve">[…]</w:t>
+            </w:r>
+          </w:p>
+        </w:tc>
+        <w:tc>
+          <w:tcPr>
+            <w:tcW w:type="dxa" w:w="1259"/>
+            <w:tcBorders>
+              <w:top w:val="single" w:color="808080" w:sz="4"/>
+              <w:left w:val="single" w:color="808080" w:sz="4"/>
+              <w:bottom w:val="single" w:color="808080" w:sz="4"/>
+              <w:right w:val="single" w:color="808080" w:sz="4"/>
+            </w:tcBorders>
+            <w:tcMar>
+              <w:top w:type="dxa" w:w="60"/>
+              <w:left w:type="dxa" w:w="100"/>
+              <w:bottom w:type="dxa" w:w="60"/>
+              <w:right w:type="dxa" w:w="100"/>
+            </w:tcMar>
+            <w:vAlign w:val="center"/>
+          </w:tcPr>
+          <w:p>
+            <w:pPr>
+              <w:spacing w:after="40" w:line="240"/>
+              <w:ind w:firstLine="0"/>
+              <w:jc w:val="left"/>
+            </w:pPr>
+            <w:r>
+              <w:rPr>
+                <w:b w:val="false"/>
+                <w:bCs w:val="false"/>
+                <w:sz w:val="22"/>
+                <w:szCs w:val="22"/>
+              </w:rPr>
+              <w:t xml:space="preserve">Commission</w:t>
+            </w:r>
+          </w:p>
+        </w:tc>
+        <w:tc>
+          <w:tcPr>
+            <w:tcW w:type="dxa" w:w="1259"/>
+            <w:tcBorders>
+              <w:top w:val="single" w:color="808080" w:sz="4"/>
+              <w:left w:val="single" w:color="808080" w:sz="4"/>
+              <w:bottom w:val="single" w:color="808080" w:sz="4"/>
+              <w:right w:val="single" w:color="808080" w:sz="4"/>
+            </w:tcBorders>
+            <w:tcMar>
+              <w:top w:type="dxa" w:w="60"/>
+              <w:left w:type="dxa" w:w="100"/>
+              <w:bottom w:type="dxa" w:w="60"/>
+              <w:right w:type="dxa" w:w="100"/>
+            </w:tcMar>
+            <w:vAlign w:val="center"/>
+          </w:tcPr>
+          <w:p>
+            <w:pPr>
+              <w:spacing w:after="40" w:line="240"/>
+              <w:ind w:firstLine="0"/>
+              <w:jc w:val="left"/>
+            </w:pPr>
+            <w:r>
+              <w:rPr>
+                <w:b w:val="false"/>
+                <w:bCs w:val="false"/>
+                <w:sz w:val="22"/>
+                <w:szCs w:val="22"/>
+              </w:rPr>
+              <w:t xml:space="preserve">Par transaction</w:t>
+            </w:r>
+          </w:p>
+        </w:tc>
+        <w:tc>
+          <w:tcPr>
+            <w:tcW w:type="dxa" w:w="1133"/>
+            <w:tcBorders>
+              <w:top w:val="single" w:color="808080" w:sz="4"/>
+              <w:left w:val="single" w:color="808080" w:sz="4"/>
+              <w:bottom w:val="single" w:color="808080" w:sz="4"/>
+              <w:right w:val="single" w:color="808080" w:sz="4"/>
+            </w:tcBorders>
+            <w:tcMar>
+              <w:top w:type="dxa" w:w="60"/>
+              <w:left w:type="dxa" w:w="100"/>
+              <w:bottom w:type="dxa" w:w="60"/>
+              <w:right w:type="dxa" w:w="100"/>
+            </w:tcMar>
+            <w:vAlign w:val="center"/>
+          </w:tcPr>
+          <w:p>
+            <w:pPr>
+              <w:spacing w:after="40" w:line="240"/>
+              <w:ind w:firstLine="0"/>
+              <w:jc w:val="left"/>
+            </w:pPr>
+            <w:r>
+              <w:rPr>
+                <w:b w:val="false"/>
+                <w:bCs w:val="false"/>
+                <w:sz w:val="22"/>
+                <w:szCs w:val="22"/>
+              </w:rPr>
+              <w:t xml:space="preserve">[… %]</w:t>
+            </w:r>
+          </w:p>
+        </w:tc>
+        <w:tc>
+          <w:tcPr>
+            <w:tcW w:type="dxa" w:w="1389"/>
+            <w:tcBorders>
+              <w:top w:val="single" w:color="808080" w:sz="4"/>
+              <w:left w:val="single" w:color="808080" w:sz="4"/>
+              <w:bottom w:val="single" w:color="808080" w:sz="4"/>
+              <w:right w:val="single" w:color="808080" w:sz="4"/>
+            </w:tcBorders>
+            <w:tcMar>
+              <w:top w:type="dxa" w:w="60"/>
+              <w:left w:type="dxa" w:w="100"/>
+              <w:bottom w:type="dxa" w:w="60"/>
+              <w:right w:type="dxa" w:w="100"/>
+            </w:tcMar>
+            <w:vAlign w:val="center"/>
+          </w:tcPr>
+          <w:p>
+            <w:pPr>
+              <w:spacing w:after="40" w:line="240"/>
+              <w:ind w:firstLine="0"/>
+              <w:jc w:val="left"/>
+            </w:pPr>
+            <w:r>
+              <w:rPr>
+                <w:b w:val="false"/>
+                <w:bCs w:val="false"/>
+                <w:sz w:val="22"/>
+                <w:szCs w:val="22"/>
+              </w:rPr>
+              <w:t xml:space="preserve">—</w:t>
+            </w:r>
+          </w:p>
+        </w:tc>
+      </w:tr>
+    </w:tbl>
+    <w:p>
+      <w:pPr>
+        <w:pStyle w:val="Consigne"/>
+      </w:pPr>
+      <w:r>
+        <w:t xml:space="preserve">[Puis un récapitulatif Scénario | Coûts uniques | Coût mensuel | Coût annuel. Dater les tarifs et le taux de change ; vérifier chaque tarif sur le site du fournisseur.]</w:t>
+      </w:r>
+    </w:p>
+    <w:p>
+      <w:pPr>
         <w:pStyle w:val="Consigne"/>
       </w:pPr>
       <w:r>
@@ -7107,12 +9020,454 @@
         <w:t xml:space="preserve">Annexe B : Guide d'entretien</w:t>
       </w:r>
     </w:p>
+    <w:tbl>
+      <w:tblPr>
+        <w:tblW w:type="dxa" w:w="7936"/>
+        <w:tblBorders>
+          <w:top w:val="single" w:color="auto" w:sz="4"/>
+          <w:left w:val="single" w:color="auto" w:sz="4"/>
+          <w:bottom w:val="single" w:color="auto" w:sz="4"/>
+          <w:right w:val="single" w:color="auto" w:sz="4"/>
+          <w:insideH w:val="single" w:color="auto" w:sz="4"/>
+          <w:insideV w:val="single" w:color="auto" w:sz="4"/>
+        </w:tblBorders>
+      </w:tblPr>
+      <w:tblGrid>
+        <w:gridCol w:w="1895"/>
+        <w:gridCol w:w="1539"/>
+        <w:gridCol w:w="1184"/>
+        <w:gridCol w:w="1184"/>
+        <w:gridCol w:w="947"/>
+        <w:gridCol w:w="1187"/>
+      </w:tblGrid>
+      <w:tr>
+        <w:trPr>
+          <w:tblHeader/>
+        </w:trPr>
+        <w:tc>
+          <w:tcPr>
+            <w:tcW w:type="dxa" w:w="1895"/>
+            <w:tcBorders>
+              <w:top w:val="single" w:color="808080" w:sz="4"/>
+              <w:left w:val="single" w:color="808080" w:sz="4"/>
+              <w:bottom w:val="single" w:color="808080" w:sz="4"/>
+              <w:right w:val="single" w:color="808080" w:sz="4"/>
+            </w:tcBorders>
+            <w:shd w:fill="D9E2F3" w:color="auto" w:val="clear"/>
+            <w:tcMar>
+              <w:top w:type="dxa" w:w="60"/>
+              <w:left w:type="dxa" w:w="100"/>
+              <w:bottom w:type="dxa" w:w="60"/>
+              <w:right w:type="dxa" w:w="100"/>
+            </w:tcMar>
+            <w:vAlign w:val="center"/>
+          </w:tcPr>
+          <w:p>
+            <w:pPr>
+              <w:spacing w:after="40" w:line="240"/>
+              <w:ind w:firstLine="0"/>
+              <w:jc w:val="left"/>
+            </w:pPr>
+            <w:r>
+              <w:rPr>
+                <w:b/>
+                <w:bCs/>
+                <w:sz w:val="22"/>
+                <w:szCs w:val="22"/>
+              </w:rPr>
+              <w:t xml:space="preserve">Interlocuteur (fonction)</w:t>
+            </w:r>
+          </w:p>
+        </w:tc>
+        <w:tc>
+          <w:tcPr>
+            <w:tcW w:type="dxa" w:w="1539"/>
+            <w:tcBorders>
+              <w:top w:val="single" w:color="808080" w:sz="4"/>
+              <w:left w:val="single" w:color="808080" w:sz="4"/>
+              <w:bottom w:val="single" w:color="808080" w:sz="4"/>
+              <w:right w:val="single" w:color="808080" w:sz="4"/>
+            </w:tcBorders>
+            <w:shd w:fill="D9E2F3" w:color="auto" w:val="clear"/>
+            <w:tcMar>
+              <w:top w:type="dxa" w:w="60"/>
+              <w:left w:type="dxa" w:w="100"/>
+              <w:bottom w:type="dxa" w:w="60"/>
+              <w:right w:type="dxa" w:w="100"/>
+            </w:tcMar>
+            <w:vAlign w:val="center"/>
+          </w:tcPr>
+          <w:p>
+            <w:pPr>
+              <w:spacing w:after="40" w:line="240"/>
+              <w:ind w:firstLine="0"/>
+              <w:jc w:val="left"/>
+            </w:pPr>
+            <w:r>
+              <w:rPr>
+                <w:b/>
+                <w:bCs/>
+                <w:sz w:val="22"/>
+                <w:szCs w:val="22"/>
+              </w:rPr>
+              <w:t xml:space="preserve">Type de structure</w:t>
+            </w:r>
+          </w:p>
+        </w:tc>
+        <w:tc>
+          <w:tcPr>
+            <w:tcW w:type="dxa" w:w="1184"/>
+            <w:tcBorders>
+              <w:top w:val="single" w:color="808080" w:sz="4"/>
+              <w:left w:val="single" w:color="808080" w:sz="4"/>
+              <w:bottom w:val="single" w:color="808080" w:sz="4"/>
+              <w:right w:val="single" w:color="808080" w:sz="4"/>
+            </w:tcBorders>
+            <w:shd w:fill="D9E2F3" w:color="auto" w:val="clear"/>
+            <w:tcMar>
+              <w:top w:type="dxa" w:w="60"/>
+              <w:left w:type="dxa" w:w="100"/>
+              <w:bottom w:type="dxa" w:w="60"/>
+              <w:right w:type="dxa" w:w="100"/>
+            </w:tcMar>
+            <w:vAlign w:val="center"/>
+          </w:tcPr>
+          <w:p>
+            <w:pPr>
+              <w:spacing w:after="40" w:line="240"/>
+              <w:ind w:firstLine="0"/>
+              <w:jc w:val="left"/>
+            </w:pPr>
+            <w:r>
+              <w:rPr>
+                <w:b/>
+                <w:bCs/>
+                <w:sz w:val="22"/>
+                <w:szCs w:val="22"/>
+              </w:rPr>
+              <w:t xml:space="preserve">Date</w:t>
+            </w:r>
+          </w:p>
+        </w:tc>
+        <w:tc>
+          <w:tcPr>
+            <w:tcW w:type="dxa" w:w="1184"/>
+            <w:tcBorders>
+              <w:top w:val="single" w:color="808080" w:sz="4"/>
+              <w:left w:val="single" w:color="808080" w:sz="4"/>
+              <w:bottom w:val="single" w:color="808080" w:sz="4"/>
+              <w:right w:val="single" w:color="808080" w:sz="4"/>
+            </w:tcBorders>
+            <w:shd w:fill="D9E2F3" w:color="auto" w:val="clear"/>
+            <w:tcMar>
+              <w:top w:type="dxa" w:w="60"/>
+              <w:left w:type="dxa" w:w="100"/>
+              <w:bottom w:type="dxa" w:w="60"/>
+              <w:right w:type="dxa" w:w="100"/>
+            </w:tcMar>
+            <w:vAlign w:val="center"/>
+          </w:tcPr>
+          <w:p>
+            <w:pPr>
+              <w:spacing w:after="40" w:line="240"/>
+              <w:ind w:firstLine="0"/>
+              <w:jc w:val="left"/>
+            </w:pPr>
+            <w:r>
+              <w:rPr>
+                <w:b/>
+                <w:bCs/>
+                <w:sz w:val="22"/>
+                <w:szCs w:val="22"/>
+              </w:rPr>
+              <w:t xml:space="preserve">Lieu</w:t>
+            </w:r>
+          </w:p>
+        </w:tc>
+        <w:tc>
+          <w:tcPr>
+            <w:tcW w:type="dxa" w:w="947"/>
+            <w:tcBorders>
+              <w:top w:val="single" w:color="808080" w:sz="4"/>
+              <w:left w:val="single" w:color="808080" w:sz="4"/>
+              <w:bottom w:val="single" w:color="808080" w:sz="4"/>
+              <w:right w:val="single" w:color="808080" w:sz="4"/>
+            </w:tcBorders>
+            <w:shd w:fill="D9E2F3" w:color="auto" w:val="clear"/>
+            <w:tcMar>
+              <w:top w:type="dxa" w:w="60"/>
+              <w:left w:type="dxa" w:w="100"/>
+              <w:bottom w:type="dxa" w:w="60"/>
+              <w:right w:type="dxa" w:w="100"/>
+            </w:tcMar>
+            <w:vAlign w:val="center"/>
+          </w:tcPr>
+          <w:p>
+            <w:pPr>
+              <w:spacing w:after="40" w:line="240"/>
+              <w:ind w:firstLine="0"/>
+              <w:jc w:val="left"/>
+            </w:pPr>
+            <w:r>
+              <w:rPr>
+                <w:b/>
+                <w:bCs/>
+                <w:sz w:val="22"/>
+                <w:szCs w:val="22"/>
+              </w:rPr>
+              <w:t xml:space="preserve">Durée</w:t>
+            </w:r>
+          </w:p>
+        </w:tc>
+        <w:tc>
+          <w:tcPr>
+            <w:tcW w:type="dxa" w:w="1187"/>
+            <w:tcBorders>
+              <w:top w:val="single" w:color="808080" w:sz="4"/>
+              <w:left w:val="single" w:color="808080" w:sz="4"/>
+              <w:bottom w:val="single" w:color="808080" w:sz="4"/>
+              <w:right w:val="single" w:color="808080" w:sz="4"/>
+            </w:tcBorders>
+            <w:shd w:fill="D9E2F3" w:color="auto" w:val="clear"/>
+            <w:tcMar>
+              <w:top w:type="dxa" w:w="60"/>
+              <w:left w:type="dxa" w:w="100"/>
+              <w:bottom w:type="dxa" w:w="60"/>
+              <w:right w:type="dxa" w:w="100"/>
+            </w:tcMar>
+            <w:vAlign w:val="center"/>
+          </w:tcPr>
+          <w:p>
+            <w:pPr>
+              <w:spacing w:after="40" w:line="240"/>
+              <w:ind w:firstLine="0"/>
+              <w:jc w:val="left"/>
+            </w:pPr>
+            <w:r>
+              <w:rPr>
+                <w:b/>
+                <w:bCs/>
+                <w:sz w:val="22"/>
+                <w:szCs w:val="22"/>
+              </w:rPr>
+              <w:t xml:space="preserve">Mode</w:t>
+            </w:r>
+          </w:p>
+        </w:tc>
+      </w:tr>
+      <w:tr>
+        <w:tc>
+          <w:tcPr>
+            <w:tcW w:type="dxa" w:w="1895"/>
+            <w:tcBorders>
+              <w:top w:val="single" w:color="808080" w:sz="4"/>
+              <w:left w:val="single" w:color="808080" w:sz="4"/>
+              <w:bottom w:val="single" w:color="808080" w:sz="4"/>
+              <w:right w:val="single" w:color="808080" w:sz="4"/>
+            </w:tcBorders>
+            <w:tcMar>
+              <w:top w:type="dxa" w:w="60"/>
+              <w:left w:type="dxa" w:w="100"/>
+              <w:bottom w:type="dxa" w:w="60"/>
+              <w:right w:type="dxa" w:w="100"/>
+            </w:tcMar>
+            <w:vAlign w:val="center"/>
+          </w:tcPr>
+          <w:p>
+            <w:pPr>
+              <w:spacing w:after="40" w:line="240"/>
+              <w:ind w:firstLine="0"/>
+              <w:jc w:val="left"/>
+            </w:pPr>
+            <w:r>
+              <w:rPr>
+                <w:b w:val="false"/>
+                <w:bCs w:val="false"/>
+                <w:sz w:val="22"/>
+                <w:szCs w:val="22"/>
+              </w:rPr>
+              <w:t xml:space="preserve">[Responsable du service …]</w:t>
+            </w:r>
+          </w:p>
+        </w:tc>
+        <w:tc>
+          <w:tcPr>
+            <w:tcW w:type="dxa" w:w="1539"/>
+            <w:tcBorders>
+              <w:top w:val="single" w:color="808080" w:sz="4"/>
+              <w:left w:val="single" w:color="808080" w:sz="4"/>
+              <w:bottom w:val="single" w:color="808080" w:sz="4"/>
+              <w:right w:val="single" w:color="808080" w:sz="4"/>
+            </w:tcBorders>
+            <w:tcMar>
+              <w:top w:type="dxa" w:w="60"/>
+              <w:left w:type="dxa" w:w="100"/>
+              <w:bottom w:type="dxa" w:w="60"/>
+              <w:right w:type="dxa" w:w="100"/>
+            </w:tcMar>
+            <w:vAlign w:val="center"/>
+          </w:tcPr>
+          <w:p>
+            <w:pPr>
+              <w:spacing w:after="40" w:line="240"/>
+              <w:ind w:firstLine="0"/>
+              <w:jc w:val="left"/>
+            </w:pPr>
+            <w:r>
+              <w:rPr>
+                <w:b w:val="false"/>
+                <w:bCs w:val="false"/>
+                <w:sz w:val="22"/>
+                <w:szCs w:val="22"/>
+              </w:rPr>
+              <w:t xml:space="preserve">[…]</w:t>
+            </w:r>
+          </w:p>
+        </w:tc>
+        <w:tc>
+          <w:tcPr>
+            <w:tcW w:type="dxa" w:w="1184"/>
+            <w:tcBorders>
+              <w:top w:val="single" w:color="808080" w:sz="4"/>
+              <w:left w:val="single" w:color="808080" w:sz="4"/>
+              <w:bottom w:val="single" w:color="808080" w:sz="4"/>
+              <w:right w:val="single" w:color="808080" w:sz="4"/>
+            </w:tcBorders>
+            <w:tcMar>
+              <w:top w:type="dxa" w:w="60"/>
+              <w:left w:type="dxa" w:w="100"/>
+              <w:bottom w:type="dxa" w:w="60"/>
+              <w:right w:type="dxa" w:w="100"/>
+            </w:tcMar>
+            <w:vAlign w:val="center"/>
+          </w:tcPr>
+          <w:p>
+            <w:pPr>
+              <w:spacing w:after="40" w:line="240"/>
+              <w:ind w:firstLine="0"/>
+              <w:jc w:val="left"/>
+            </w:pPr>
+            <w:r>
+              <w:rPr>
+                <w:b w:val="false"/>
+                <w:bCs w:val="false"/>
+                <w:sz w:val="22"/>
+                <w:szCs w:val="22"/>
+              </w:rPr>
+              <w:t xml:space="preserve">[JJ/MM/AAAA]</w:t>
+            </w:r>
+          </w:p>
+        </w:tc>
+        <w:tc>
+          <w:tcPr>
+            <w:tcW w:type="dxa" w:w="1184"/>
+            <w:tcBorders>
+              <w:top w:val="single" w:color="808080" w:sz="4"/>
+              <w:left w:val="single" w:color="808080" w:sz="4"/>
+              <w:bottom w:val="single" w:color="808080" w:sz="4"/>
+              <w:right w:val="single" w:color="808080" w:sz="4"/>
+            </w:tcBorders>
+            <w:tcMar>
+              <w:top w:type="dxa" w:w="60"/>
+              <w:left w:type="dxa" w:w="100"/>
+              <w:bottom w:type="dxa" w:w="60"/>
+              <w:right w:type="dxa" w:w="100"/>
+            </w:tcMar>
+            <w:vAlign w:val="center"/>
+          </w:tcPr>
+          <w:p>
+            <w:pPr>
+              <w:spacing w:after="40" w:line="240"/>
+              <w:ind w:firstLine="0"/>
+              <w:jc w:val="left"/>
+            </w:pPr>
+            <w:r>
+              <w:rPr>
+                <w:b w:val="false"/>
+                <w:bCs w:val="false"/>
+                <w:sz w:val="22"/>
+                <w:szCs w:val="22"/>
+              </w:rPr>
+              <w:t xml:space="preserve">[…]</w:t>
+            </w:r>
+          </w:p>
+        </w:tc>
+        <w:tc>
+          <w:tcPr>
+            <w:tcW w:type="dxa" w:w="947"/>
+            <w:tcBorders>
+              <w:top w:val="single" w:color="808080" w:sz="4"/>
+              <w:left w:val="single" w:color="808080" w:sz="4"/>
+              <w:bottom w:val="single" w:color="808080" w:sz="4"/>
+              <w:right w:val="single" w:color="808080" w:sz="4"/>
+            </w:tcBorders>
+            <w:tcMar>
+              <w:top w:type="dxa" w:w="60"/>
+              <w:left w:type="dxa" w:w="100"/>
+              <w:bottom w:type="dxa" w:w="60"/>
+              <w:right w:type="dxa" w:w="100"/>
+            </w:tcMar>
+            <w:vAlign w:val="center"/>
+          </w:tcPr>
+          <w:p>
+            <w:pPr>
+              <w:spacing w:after="40" w:line="240"/>
+              <w:ind w:firstLine="0"/>
+              <w:jc w:val="left"/>
+            </w:pPr>
+            <w:r>
+              <w:rPr>
+                <w:b w:val="false"/>
+                <w:bCs w:val="false"/>
+                <w:sz w:val="22"/>
+                <w:szCs w:val="22"/>
+              </w:rPr>
+              <w:t xml:space="preserve">[… min]</w:t>
+            </w:r>
+          </w:p>
+        </w:tc>
+        <w:tc>
+          <w:tcPr>
+            <w:tcW w:type="dxa" w:w="1187"/>
+            <w:tcBorders>
+              <w:top w:val="single" w:color="808080" w:sz="4"/>
+              <w:left w:val="single" w:color="808080" w:sz="4"/>
+              <w:bottom w:val="single" w:color="808080" w:sz="4"/>
+              <w:right w:val="single" w:color="808080" w:sz="4"/>
+            </w:tcBorders>
+            <w:tcMar>
+              <w:top w:type="dxa" w:w="60"/>
+              <w:left w:type="dxa" w:w="100"/>
+              <w:bottom w:type="dxa" w:w="60"/>
+              <w:right w:type="dxa" w:w="100"/>
+            </w:tcMar>
+            <w:vAlign w:val="center"/>
+          </w:tcPr>
+          <w:p>
+            <w:pPr>
+              <w:spacing w:after="40" w:line="240"/>
+              <w:ind w:firstLine="0"/>
+              <w:jc w:val="left"/>
+            </w:pPr>
+            <w:r>
+              <w:rPr>
+                <w:b w:val="false"/>
+                <w:bCs w:val="false"/>
+                <w:sz w:val="22"/>
+                <w:szCs w:val="22"/>
+              </w:rPr>
+              <w:t xml:space="preserve">[Présentiel]</w:t>
+            </w:r>
+          </w:p>
+        </w:tc>
+      </w:tr>
+    </w:tbl>
     <w:p>
       <w:pPr>
         <w:pStyle w:val="Consigne"/>
       </w:pPr>
       <w:r>
-        <w:t xml:space="preserve">[Interlocuteur (fonction), date, puis tableau N° | Question | Réponse.]</w:t>
+        <w:t xml:space="preserve">[Contexte de l'entretien (un paragraphe), puis les questions regroupées par thème : « Q1 : … ? » en italique, suivie de « Réponse : … ». Terminer par une synthèse (4 ou 5 constats) reliée aux exigences. Désigner l'interlocuteur par sa fonction, jamais par son nom.]</w:t>
       </w:r>
     </w:p>
     <w:p>

</xml_diff>

<commit_message>
fix(modele-word): sous-sections en taille 14 (v1.6.1)
</commit_message>
<xml_diff>
--- a/plugins/dev-memoire-kit/skills/redaction-memoire/assets/modele-memoire.docx
+++ b/plugins/dev-memoire-kit/skills/redaction-memoire/assets/modele-memoire.docx
@@ -10106,8 +10106,8 @@
     <w:rPr>
       <w:b/>
       <w:bCs/>
-      <w:sz w:val="26"/>
-      <w:szCs w:val="26"/>
+      <w:sz w:val="28"/>
+      <w:szCs w:val="28"/>
     </w:rPr>
   </w:style>
   <w:style w:type="paragraph" w:styleId="Intertitre">

</xml_diff>

<commit_message>
fix: corrections issues de la relecture d'un brouillon (vérificateur, marqueurs, hypothèses, migration) (v1.7.0)
</commit_message>
<xml_diff>
--- a/plugins/dev-memoire-kit/skills/redaction-memoire/assets/modele-memoire.docx
+++ b/plugins/dev-memoire-kit/skills/redaction-memoire/assets/modele-memoire.docx
@@ -372,22 +372,27 @@
               <w:jc w:val="left"/>
             </w:pPr>
             <w:r>
-              <w:t xml:space="preserve">M./Mme Prénom NOM</w:t>
-            </w:r>
-          </w:p>
-          <w:p>
-            <w:pPr>
-              <w:spacing w:after="60" w:line="276"/>
-              <w:ind w:firstLine="0"/>
-              <w:jc w:val="left"/>
-            </w:pPr>
-            <w:r>
               <w:rPr>
                 <w:i/>
                 <w:iCs/>
                 <w:color w:val="595959"/>
               </w:rPr>
-              <w:t xml:space="preserve">[autres membres du groupe]</w:t>
+              <w:t xml:space="preserve">[M. ou Mme Prénom NOM de l'étudiant]</w:t>
+            </w:r>
+          </w:p>
+          <w:p>
+            <w:pPr>
+              <w:spacing w:after="60" w:line="276"/>
+              <w:ind w:firstLine="0"/>
+              <w:jc w:val="left"/>
+            </w:pPr>
+            <w:r>
+              <w:rPr>
+                <w:i/>
+                <w:iCs/>
+                <w:color w:val="595959"/>
+              </w:rPr>
+              <w:t xml:space="preserve">[autres membres du groupe, ou supprimer]</w:t>
             </w:r>
           </w:p>
         </w:tc>
@@ -423,7 +428,12 @@
               <w:jc w:val="right"/>
             </w:pPr>
             <w:r>
-              <w:t xml:space="preserve">M./Mme Prénom NOM</w:t>
+              <w:rPr>
+                <w:i/>
+                <w:iCs/>
+                <w:color w:val="595959"/>
+              </w:rPr>
+              <w:t xml:space="preserve">[M. ou Mme Prénom NOM du directeur]</w:t>
             </w:r>
           </w:p>
           <w:p>
@@ -436,6 +446,9 @@
               <w:rPr>
                 <w:b/>
                 <w:bCs/>
+                <w:i/>
+                <w:iCs/>
+                <w:color w:val="595959"/>
               </w:rPr>
               <w:t xml:space="preserve">[Qualité : Ingénieur logiciel…]</w:t>
             </w:r>
@@ -1239,7 +1252,7 @@
         <w:pStyle w:val="Consigne"/>
       </w:pPr>
       <w:r>
-        <w:t xml:space="preserve">[Introduction du chapitre : le situer et annoncer ses sections dans l'ordre et en nombre exact (« Il s'articule autour de six sections… »).]</w:t>
+        <w:t xml:space="preserve">[Introduction du chapitre : le situer et annoncer ses sections dans l'ordre et en nombre exact (« Il s'articule autour de six sections… »). Les marqueurs [À COMPLÉTER : …] nomment l'objet manquant en quelques mots ; aucune note de travail ne reste dans le document.]</w:t>
       </w:r>
     </w:p>
     <w:p>
@@ -1440,6 +1453,22 @@
       </w:r>
       <w:r>
         <w:t xml:space="preserve"> il s'agit de vérifier que la solution répond aux exigences.</w:t>
+      </w:r>
+    </w:p>
+    <w:p>
+      <w:pPr>
+        <w:pStyle w:val="Heading3"/>
+      </w:pPr>
+      <w:r>
+        <w:t xml:space="preserve">1.4.3. Hypothèses de travail</w:t>
+      </w:r>
+    </w:p>
+    <w:p>
+      <w:pPr>
+        <w:pStyle w:val="Consigne"/>
+      </w:pPr>
+      <w:r>
+        <w:t xml:space="preserve">[Facultatif (sinon dans l'introduction). Une ou deux hypothèses vérifiables « Si…, alors… », avec le critère qui permettra de conclure ; elles seront revues en 3.4.]</w:t>
       </w:r>
     </w:p>
     <w:p>

</xml_diff>